<commit_message>
feat: Rehacer y elevar formalmente el Modelo Conceptual con diagramas graficos 300 DPI (IDEF0 A-0, IDEF0 A0, Causalidad, Flujo Logico y Arquitectura SimPy) y exportacion a Word
</commit_message>
<xml_diff>
--- a/INFORME_EJECUTIVO_PUERTO_SUR.docx
+++ b/INFORME_EJECUTIVO_PUERTO_SUR.docx
@@ -44,7 +44,7 @@
           <w:color w:val="2F5597"/>
           <w:sz w:val="24"/>
         </w:rPr>
-        <w:t>Evaluación de Capacidad, Teoría de Colas, Cuellos de Botella y Decisiones Estratégicas de Inversión</w:t>
+        <w:t>Informe Integral y Autocontenido: Modelo Conceptual, Teoría de Colas, Simulación SimPy, Experimentación y Decisiones Estratégicas</w:t>
       </w:r>
     </w:p>
     <w:tbl>
@@ -338,11 +338,8 @@
       </w:r>
     </w:p>
     <w:p>
-      <w:pPr>
-        <w:spacing w:after="200"/>
-      </w:pPr>
       <w:r>
-        <w:t>El presente informe documenta el desarrollo conceptual, la formulación analítica de líneas de espera, la implementación en SimPy y la experimentación estadística del sistema portuario de Puerto Sur para el Grupo 08. La siguiente tabla consolida las respuestas técnicas y recomendaciones estratégicas a cada una de las consignas requeridas por la cátedra:</w:t>
+        <w:t>A continuación se presenta la tabla consolidada con las respuestas cuantitativas y recomendaciones estratégicas a cada una de las consignas requeridas por la cátedra para el Grupo 08:</w:t>
       </w:r>
     </w:p>
     <w:tbl>
@@ -1035,7 +1032,7 @@
         <w:rPr>
           <w:color w:val="1F4E79"/>
         </w:rPr>
-        <w:t>Sección 1: Modelo Conceptual</w:t>
+        <w:t>Sección 1: Modelo Conceptual Formal</w:t>
       </w:r>
     </w:p>
     <w:p>
@@ -1046,12 +1043,17 @@
         <w:rPr>
           <w:color w:val="2F5597"/>
         </w:rPr>
-        <w:t>1.1. Objetivo General y Específicos</w:t>
+        <w:t>1.1. Objetivo y Clasificación de Variables</w:t>
       </w:r>
     </w:p>
     <w:p>
       <w:r>
-        <w:t>El objetivo general es estructurar un modelo de simulación de eventos discretos que capture la dinámica operativa, logística y de capacidad de la Terminal Portuaria Puerto Sur, a fin de evaluar cuantitativamente el cumplimiento del compromiso de estadía promedio contractual (W &lt;= 16 horas), detectar cuellos de botella en muelle y patio, y evaluar la viabilidad de alternativas de expansión de capacidad (4ª grúa y 4ª berma) y convenios comerciales (temporada de cruceros y proyecto industrial).</w:t>
+        <w:t>El objetivo general es estructurar un modelo DES para Puerto Sur que permita evaluar cuantitativamente la capacidad de sostener una estadía W &lt;= 16 horas con las navieras regulares, identificar cuellos de botella en muelle y patio, y evaluar la viabilidad de la 4ª grúa, la 4ª berma y el impacto de los cruceros.</w:t>
+      </w:r>
+    </w:p>
+    <w:p>
+      <w:r>
+        <w:t>Se clasificaron rigurosamente las variables de decisión (Bermas B in {2,3,4}, Grúas G in {3,4}, políticas de camiones y cruceros), variables de referencia exógenas (arribos Delta t del Grupo 8, mix de carga, turnos, paradas de cambio de guardia) y variables de salida/KPIs (W, Wq, Ws, % espera, L, Lq y Payback).</w:t>
       </w:r>
     </w:p>
     <w:p>
@@ -1062,27 +1064,62 @@
         <w:rPr>
           <w:color w:val="2F5597"/>
         </w:rPr>
-        <w:t>1.2. Variables de Decisión y de Referencia</w:t>
+        <w:t>1.2. Relación Causal entre Variables</w:t>
       </w:r>
     </w:p>
     <w:p>
       <w:r>
-        <w:t>Las variables del sistema se clasifican rigurosamente:</w:t>
+        <w:t>A continuación se presenta el Diagrama de Relación Causal entre Variables de Decisión, Exógenas, Estado y Salidas:</w:t>
       </w:r>
     </w:p>
     <w:p>
       <w:r>
-        <w:t>• Variables de Decisión (Controlables): Cantidad de bermas comerciales asignadas (B in {2, 3, 4}), dotación de grúas pórtico STS (G in {3, 4}), políticas de despacho de grúas (máximo 2 grúas simultáneas con factor de interferencia de 85%), régimen nocturno de grúas (standby con 15-20 min de alistamiento vs activa continua), políticas de tolerancia horaria para camiones y régimen de exclusividad para cruceros.</w:t>
+        <w:drawing>
+          <wp:inline xmlns:a="http://schemas.openxmlformats.org/drawingml/2006/main" xmlns:pic="http://schemas.openxmlformats.org/drawingml/2006/picture">
+            <wp:extent cx="5486400" cy="3740727"/>
+            <wp:docPr id="1" name="Picture 1"/>
+            <wp:cNvGraphicFramePr>
+              <a:graphicFrameLocks noChangeAspect="1"/>
+            </wp:cNvGraphicFramePr>
+            <a:graphic>
+              <a:graphicData uri="http://schemas.openxmlformats.org/drawingml/2006/picture">
+                <pic:pic>
+                  <pic:nvPicPr>
+                    <pic:cNvPr id="0" name="fig_relacion_variables_causal.png"/>
+                    <pic:cNvPicPr/>
+                  </pic:nvPicPr>
+                  <pic:blipFill>
+                    <a:blip r:embed="rId9"/>
+                    <a:stretch>
+                      <a:fillRect/>
+                    </a:stretch>
+                  </pic:blipFill>
+                  <pic:spPr>
+                    <a:xfrm>
+                      <a:off x="0" y="0"/>
+                      <a:ext cx="5486400" cy="3740727"/>
+                    </a:xfrm>
+                    <a:prstGeom prst="rect"/>
+                  </pic:spPr>
+                </pic:pic>
+              </a:graphicData>
+            </a:graphic>
+          </wp:inline>
+        </w:drawing>
       </w:r>
     </w:p>
     <w:p>
+      <w:pPr>
+        <w:spacing w:before="80" w:after="240"/>
+        <w:jc w:val="center"/>
+      </w:pPr>
       <w:r>
-        <w:t>• Variables de Referencia (Exógenas): Arribos de buques feeders (Delta t histórico Grupo 8), composición de carga (movimientos Dry, Reefer, OOG), rendimientos de grúa (Dry: 28 mov/h, Reefer: 21 mov/h, OOG: 12 mov/h), tiempos de maniobra (1 a 2 horas al entrar y al salir), paradas de cambio de turno (10 a 15 min), permanencia de contenedores en patio (media 72 h), impuntualidad de camiones (20% a 30% tardíos) y costos de inmovilización de buques (USD 15.000 a 30.000 / día).</w:t>
-      </w:r>
-    </w:p>
-    <w:p>
-      <w:r>
-        <w:t>• Variables de Salida (KPIs): Estadía promedio total W, espera media en rada Wq, tiempo en berma Ws, porcentaje del tiempo en espera (Wq/W), cantidad promedio de buques en el puerto L y en rada Lq, nivel de servicio (% buques &lt;= 16h), y período de repago de inversiones.</w:t>
+        <w:rPr>
+          <w:i/>
+          <w:color w:val="505050"/>
+          <w:sz w:val="17"/>
+        </w:rPr>
+        <w:t>Figura 1: Diagrama de Influencias Causales entre Variables del Sistema Portuario</w:t>
       </w:r>
     </w:p>
     <w:p>
@@ -1093,12 +1130,107 @@
         <w:rPr>
           <w:color w:val="2F5597"/>
         </w:rPr>
-        <w:t>1.3. Plan de Análisis y Visualización de Resultados</w:t>
+        <w:t>1.3. Diagramas IDEF0 (Contexto y Descomposición Funcional)</w:t>
       </w:r>
     </w:p>
     <w:p>
       <w:r>
-        <w:t>El plan experimental comprende 6 fases: 1) Análisis exploratorio y ajuste de distribuciones del Grupo 8; 2) Modelo analítico de colas a priori; 3) Simulación de línea base; 4) Barridos de capacidad límite y evaluación de 4ª grúa; 5) Análisis de cruceros y proyecto industrial; 6) Verificación estadística mediante ANOVA y Test de Tukey HSD (FWER = 0.05).</w:t>
+        <w:drawing>
+          <wp:inline xmlns:a="http://schemas.openxmlformats.org/drawingml/2006/main" xmlns:pic="http://schemas.openxmlformats.org/drawingml/2006/picture">
+            <wp:extent cx="5486400" cy="3740727"/>
+            <wp:docPr id="2" name="Picture 2"/>
+            <wp:cNvGraphicFramePr>
+              <a:graphicFrameLocks noChangeAspect="1"/>
+            </wp:cNvGraphicFramePr>
+            <a:graphic>
+              <a:graphicData uri="http://schemas.openxmlformats.org/drawingml/2006/picture">
+                <pic:pic>
+                  <pic:nvPicPr>
+                    <pic:cNvPr id="0" name="fig_idef0_a_menos_0.png"/>
+                    <pic:cNvPicPr/>
+                  </pic:nvPicPr>
+                  <pic:blipFill>
+                    <a:blip r:embed="rId10"/>
+                    <a:stretch>
+                      <a:fillRect/>
+                    </a:stretch>
+                  </pic:blipFill>
+                  <pic:spPr>
+                    <a:xfrm>
+                      <a:off x="0" y="0"/>
+                      <a:ext cx="5486400" cy="3740727"/>
+                    </a:xfrm>
+                    <a:prstGeom prst="rect"/>
+                  </pic:spPr>
+                </pic:pic>
+              </a:graphicData>
+            </a:graphic>
+          </wp:inline>
+        </w:drawing>
+      </w:r>
+    </w:p>
+    <w:p>
+      <w:pPr>
+        <w:spacing w:before="80" w:after="240"/>
+        <w:jc w:val="center"/>
+      </w:pPr>
+      <w:r>
+        <w:rPr>
+          <w:i/>
+          <w:color w:val="505050"/>
+          <w:sz w:val="17"/>
+        </w:rPr>
+        <w:t>Figura 2: Diagrama de Contexto IDEF0 A-0: Operar Terminal Portuaria Puerto Sur</w:t>
+      </w:r>
+    </w:p>
+    <w:p>
+      <w:r>
+        <w:drawing>
+          <wp:inline xmlns:a="http://schemas.openxmlformats.org/drawingml/2006/main" xmlns:pic="http://schemas.openxmlformats.org/drawingml/2006/picture">
+            <wp:extent cx="5486400" cy="3657600"/>
+            <wp:docPr id="3" name="Picture 3"/>
+            <wp:cNvGraphicFramePr>
+              <a:graphicFrameLocks noChangeAspect="1"/>
+            </wp:cNvGraphicFramePr>
+            <a:graphic>
+              <a:graphicData uri="http://schemas.openxmlformats.org/drawingml/2006/picture">
+                <pic:pic>
+                  <pic:nvPicPr>
+                    <pic:cNvPr id="0" name="fig_idef0_a0_descomposicion.png"/>
+                    <pic:cNvPicPr/>
+                  </pic:nvPicPr>
+                  <pic:blipFill>
+                    <a:blip r:embed="rId11"/>
+                    <a:stretch>
+                      <a:fillRect/>
+                    </a:stretch>
+                  </pic:blipFill>
+                  <pic:spPr>
+                    <a:xfrm>
+                      <a:off x="0" y="0"/>
+                      <a:ext cx="5486400" cy="3657600"/>
+                    </a:xfrm>
+                    <a:prstGeom prst="rect"/>
+                  </pic:spPr>
+                </pic:pic>
+              </a:graphicData>
+            </a:graphic>
+          </wp:inline>
+        </w:drawing>
+      </w:r>
+    </w:p>
+    <w:p>
+      <w:pPr>
+        <w:spacing w:before="80" w:after="240"/>
+        <w:jc w:val="center"/>
+      </w:pPr>
+      <w:r>
+        <w:rPr>
+          <w:i/>
+          <w:color w:val="505050"/>
+          <w:sz w:val="17"/>
+        </w:rPr>
+        <w:t>Figura 3: Diagrama de Descomposición Funcional IDEF0 A0 (Actividades A1 a A4)</w:t>
       </w:r>
     </w:p>
     <w:p>
@@ -1109,65 +1241,107 @@
         <w:rPr>
           <w:color w:val="2F5597"/>
         </w:rPr>
-        <w:t>1.4. Relación entre Variables (Mecanismos Causal)</w:t>
+        <w:t>1.4. Lógicas Operativas y Arquitectura del Simulador</w:t>
       </w:r>
     </w:p>
     <w:p>
       <w:r>
-        <w:t>Existe un fuerte acoplamiento causal en la terminal: Los buques que arriban ingresan a rada. Si las bermas están ocupadas, se acumula cola. Una vez amarrado, la atención depende del mix de contenedores y de las grúas disponibles. La asignación dual rinde 1.7 veces la tasa individual (85% de productividad combinada). En el turno noche, la capacidad se reduce drásticamente. Además, la descarga alimenta el patio de 3.000 slots; si la ocupación supera el 75% (&gt;2.250 slots), las grúas sufren bloqueos obligados esperando slots libres. Toda demora en berma retiene el recurso y eleva la cola en rada, disparando W.</w:t>
+        <w:drawing>
+          <wp:inline xmlns:a="http://schemas.openxmlformats.org/drawingml/2006/main" xmlns:pic="http://schemas.openxmlformats.org/drawingml/2006/picture">
+            <wp:extent cx="5303520" cy="4773168"/>
+            <wp:docPr id="4" name="Picture 4"/>
+            <wp:cNvGraphicFramePr>
+              <a:graphicFrameLocks noChangeAspect="1"/>
+            </wp:cNvGraphicFramePr>
+            <a:graphic>
+              <a:graphicData uri="http://schemas.openxmlformats.org/drawingml/2006/picture">
+                <pic:pic>
+                  <pic:nvPicPr>
+                    <pic:cNvPr id="0" name="fig_logica_flujo_buque.png"/>
+                    <pic:cNvPicPr/>
+                  </pic:nvPicPr>
+                  <pic:blipFill>
+                    <a:blip r:embed="rId12"/>
+                    <a:stretch>
+                      <a:fillRect/>
+                    </a:stretch>
+                  </pic:blipFill>
+                  <pic:spPr>
+                    <a:xfrm>
+                      <a:off x="0" y="0"/>
+                      <a:ext cx="5303520" cy="4773168"/>
+                    </a:xfrm>
+                    <a:prstGeom prst="rect"/>
+                  </pic:spPr>
+                </pic:pic>
+              </a:graphicData>
+            </a:graphic>
+          </wp:inline>
+        </w:drawing>
       </w:r>
     </w:p>
     <w:p>
       <w:pPr>
-        <w:pStyle w:val="Heading2"/>
+        <w:spacing w:before="80" w:after="240"/>
+        <w:jc w:val="center"/>
       </w:pPr>
       <w:r>
         <w:rPr>
-          <w:color w:val="2F5597"/>
+          <w:i/>
+          <w:color w:val="505050"/>
+          <w:sz w:val="17"/>
         </w:rPr>
-        <w:t>1.5. Diagrama IDEF0</w:t>
+        <w:t>Figura 4: Diagrama de Flujo Lógico Operativo del Ciclo de Atención de Escalas</w:t>
       </w:r>
     </w:p>
     <w:p>
       <w:r>
-        <w:t>• A-0 (Contexto): Entradas: buques en rada, contenedores y camiones. Controles: umbral de 16h, turnos y reglas de patio. Mecanismos: bermas, grúas STS, tractores y simulador SimPy. Salidas: buques despachados, estadía W y costos de inmovilización.</w:t>
-      </w:r>
-    </w:p>
-    <w:p>
-      <w:r>
-        <w:t>• Descomposición A0: A1: Recepción en rada (FIFO) -&gt; A2: Maniobra de atraque (1-2 h, grúas inactivas) -&gt; A3: Operación de grúas y patio -&gt; A4: Desatraque y zarpada (1-2 h).</w:t>
+        <w:drawing>
+          <wp:inline xmlns:a="http://schemas.openxmlformats.org/drawingml/2006/main" xmlns:pic="http://schemas.openxmlformats.org/drawingml/2006/picture">
+            <wp:extent cx="5486400" cy="3740727"/>
+            <wp:docPr id="5" name="Picture 5"/>
+            <wp:cNvGraphicFramePr>
+              <a:graphicFrameLocks noChangeAspect="1"/>
+            </wp:cNvGraphicFramePr>
+            <a:graphic>
+              <a:graphicData uri="http://schemas.openxmlformats.org/drawingml/2006/picture">
+                <pic:pic>
+                  <pic:nvPicPr>
+                    <pic:cNvPr id="0" name="fig_elementos_simulador.png"/>
+                    <pic:cNvPicPr/>
+                  </pic:nvPicPr>
+                  <pic:blipFill>
+                    <a:blip r:embed="rId13"/>
+                    <a:stretch>
+                      <a:fillRect/>
+                    </a:stretch>
+                  </pic:blipFill>
+                  <pic:spPr>
+                    <a:xfrm>
+                      <a:off x="0" y="0"/>
+                      <a:ext cx="5486400" cy="3740727"/>
+                    </a:xfrm>
+                    <a:prstGeom prst="rect"/>
+                  </pic:spPr>
+                </pic:pic>
+              </a:graphicData>
+            </a:graphic>
+          </wp:inline>
+        </w:drawing>
       </w:r>
     </w:p>
     <w:p>
       <w:pPr>
-        <w:pStyle w:val="Heading2"/>
+        <w:spacing w:before="80" w:after="240"/>
+        <w:jc w:val="center"/>
       </w:pPr>
       <w:r>
         <w:rPr>
-          <w:color w:val="2F5597"/>
+          <w:i/>
+          <w:color w:val="505050"/>
+          <w:sz w:val="17"/>
         </w:rPr>
-        <w:t>1.6. Lógicas del Sistema</w:t>
-      </w:r>
-    </w:p>
-    <w:p>
-      <w:r>
-        <w:t>Se implementaron formalmente: 1) Lógica de asignación de berma por disponibilidad; 2) Lógica de practicaje y remolque independiente de grúas; 3) Lógica de grúas según turnos y afectación por congestión de patio (&gt;75%); 4) Lógica de camiones externos y retiro de contenedores; 5) Lógica de cruceros con y sin reserva exclusiva.</w:t>
-      </w:r>
-    </w:p>
-    <w:p>
-      <w:pPr>
-        <w:pStyle w:val="Heading2"/>
-      </w:pPr>
-      <w:r>
-        <w:rPr>
-          <w:color w:val="2F5597"/>
-        </w:rPr>
-        <w:t>1.7. Elementos del Simulador (SimPy)</w:t>
-      </w:r>
-    </w:p>
-    <w:p>
-      <w:r>
-        <w:t>Entidades: EntidadBuque, EntidadCrucero, Contenedor, Camion. Recursos: bermas (Resource cap=3 o 4), gruas (PriorityResource dinámico), patio (Container cap=3000). Procesos: buque, crucero, turnos (temporizador de 8h con pausas de 10-15 min) y camiones. Monitor: colector de microdatos para contrastes estadísticos.</w:t>
+        <w:t>Figura 5: Diagrama de Arquitectura de Clases, Recursos y Monitores del Simulador SimPy</w:t>
       </w:r>
     </w:p>
     <w:p>
@@ -1188,38 +1362,7 @@
     </w:p>
     <w:p>
       <w:r>
-        <w:t>Del análisis de las 8.852 escalas históricas de PuertoSur_escalas_G08.csv se obtuvieron los parámetros empíricos maestros:</w:t>
-      </w:r>
-    </w:p>
-    <w:p>
-      <w:r>
-        <w:t>• Tasa media de llegadas: lambda = 8.086 buques/día (0.3369 buques/hora).</w:t>
-      </w:r>
-    </w:p>
-    <w:p>
-      <w:r>
-        <w:t>• Tiempo entre llegadas: media = 2.968 h, desvío = 7.404 h, Coeficiente de Variación CV = 2.494 (arribos agrupados).</w:t>
-      </w:r>
-    </w:p>
-    <w:p>
-      <w:r>
-        <w:t>• Servicios regulares: Austral Feeder (43.8%, 98.3 mov/buque, 3.87 h grúa), Andes Container Line (37.6%, 154.2 mov/buque, 6.17 h grúa), TransPatagonia Line (18.7%, 222.7 mov/buque, 9.01 h grúa).</w:t>
-      </w:r>
-    </w:p>
-    <w:p>
-      <w:r>
-        <w:t>• Tiempo medio en berma: Ws = 6.35 h (con 2 grúas) a 8.69 h (con 1 grúa).</w:t>
-      </w:r>
-    </w:p>
-    <w:p>
-      <w:pPr>
-        <w:pStyle w:val="Heading2"/>
-      </w:pPr>
-      <w:r>
-        <w:rPr>
-          <w:color w:val="2F5597"/>
-        </w:rPr>
-        <w:t>Contraste Analítico: Teoría de Colas vs. Simulación</w:t>
+        <w:t>Del análisis de las 8.852 escalas de PuertoSur_escalas_G08.csv se derivaron: lambda = 8.086 buques/día, tiempo entre arribos medio = 2.968 h (CV = 2.494), Austral Feeder (43.8%), Andes Container Line (37.6%), TransPatagonia Line (18.7%).</w:t>
       </w:r>
     </w:p>
     <w:tbl>
@@ -2277,14 +2420,14 @@
                 <w:color w:val="1F4E79"/>
                 <w:sz w:val="19"/>
               </w:rPr>
-              <w:t xml:space="preserve">📌 VALIDACIÓN TEÓRICA DE COLAS: </w:t>
+              <w:t xml:space="preserve">📌 VALIDACIÓN DE COLAS: </w:t>
             </w:r>
             <w:r>
               <w:rPr>
                 <w:i/>
                 <w:sz w:val="19"/>
               </w:rPr>
-              <w:t>El resultado de la simulación (W = 24.25 h) se ubica coherentemente entre el modelo M/M/3 con llegadas sin memoria (W = 18.87 h) y el modelo conservador de Allen-Cunneen (W = 28.50 a 43.36 h), validando que las restricciones operativas reales (turnos nocturnos y paradas) explican con precisión la congestión.</w:t>
+              <w:t>El resultado empírico de la simulación (W = 24.25 h) valida plenamente el modelo conceptual al ubicarse entre el M/M/3 ideal (18.87 h) y el modelo conservador de Allen-Cunneen (28.50 a 43.36 h).</w:t>
             </w:r>
           </w:p>
         </w:tc>
@@ -2303,7 +2446,7 @@
         <w:rPr>
           <w:color w:val="1F4E79"/>
         </w:rPr>
-        <w:t>Sección 3: Experimentación y Análisis Detallado</w:t>
+        <w:t>Sección 3: Experimentación y Análisis Detallado (Consignas b a g)</w:t>
       </w:r>
     </w:p>
     <w:p>
@@ -2319,32 +2462,7 @@
     </w:p>
     <w:p>
       <w:r>
-        <w:t>La simulación de las 8.852 escalas históricas demuestra que la terminal incumple severamente el umbral contractual:</w:t>
-      </w:r>
-    </w:p>
-    <w:p>
-      <w:r>
-        <w:t>• Estadía promedio total W = 24.25 horas (desvío 18.02 h).</w:t>
-      </w:r>
-    </w:p>
-    <w:p>
-      <w:r>
-        <w:t>• Tiempo promedio de espera en rada Wq = 16.32 horas (67.33% del tiempo total).</w:t>
-      </w:r>
-    </w:p>
-    <w:p>
-      <w:r>
-        <w:t>• Tiempo promedio en berma Ws = 7.92 horas (32.67% del tiempo total).</w:t>
-      </w:r>
-    </w:p>
-    <w:p>
-      <w:r>
-        <w:t>• Cantidad promedio de buques en el sistema L = 8.15 buques (5.49 en rada y 2.66 amarrados).</w:t>
-      </w:r>
-    </w:p>
-    <w:p>
-      <w:r>
-        <w:t>• El 58.10% de los buques supera las 16 horas. En TransPatagonia Line (buques grandes), el 68.5% excede el umbral.</w:t>
+        <w:t>La operación actual promedia W = 24.25 horas, con Wq = 16.32 horas (67.33% espera) y Ws = 7.92 horas (32.67% atención). L = 8.15 buques. El 58.10% de las escalas supera el límite de 16 horas. El reclamo de las navieras es totalmente fundado.</w:t>
       </w:r>
     </w:p>
     <w:p>
@@ -2352,7 +2470,7 @@
         <w:drawing>
           <wp:inline xmlns:a="http://schemas.openxmlformats.org/drawingml/2006/main" xmlns:pic="http://schemas.openxmlformats.org/drawingml/2006/picture">
             <wp:extent cx="5303520" cy="3314700"/>
-            <wp:docPr id="1" name="Picture 1"/>
+            <wp:docPr id="6" name="Picture 6"/>
             <wp:cNvGraphicFramePr>
               <a:graphicFrameLocks noChangeAspect="1"/>
             </wp:cNvGraphicFramePr>
@@ -2364,7 +2482,7 @@
                     <pic:cNvPicPr/>
                   </pic:nvPicPr>
                   <pic:blipFill>
-                    <a:blip r:embed="rId9"/>
+                    <a:blip r:embed="rId14"/>
                     <a:stretch>
                       <a:fillRect/>
                     </a:stretch>
@@ -2385,14 +2503,16 @@
     </w:p>
     <w:p>
       <w:pPr>
+        <w:spacing w:before="80" w:after="240"/>
         <w:jc w:val="center"/>
       </w:pPr>
       <w:r>
         <w:rPr>
           <w:i/>
+          <w:color w:val="505050"/>
           <w:sz w:val="17"/>
         </w:rPr>
-        <w:t>Figura 1: Desglose de Estadía Portuaria: Tiempo en Berma (Ws) vs. Espera en Rada (Wq)</w:t>
+        <w:t>Figura 6: Desglose de Estadía Portuaria: Tiempo en Berma (Ws) vs. Espera en Rada (Wq)</w:t>
       </w:r>
     </w:p>
     <w:p>
@@ -2403,22 +2523,12 @@
         <w:rPr>
           <w:color w:val="2F5597"/>
         </w:rPr>
-        <w:t>Consigna c: Compromiso de 16h y Capacidad Máxima (Actual vs. 4ª Grúa)</w:t>
+        <w:t>Consigna c: Compromiso de 16h y Beneficio de la 4ª Grúa STS</w:t>
       </w:r>
     </w:p>
     <w:p>
       <w:r>
-        <w:t>Se ejecutó un barrido de demanda diaria para determinar el punto de quiebre donde la terminal cumple W &lt;= 16 horas:</w:t>
-      </w:r>
-    </w:p>
-    <w:p>
-      <w:r>
-        <w:t>• Con 3 Grúas (Actual): La demanda diaria máxima que soporta la terminal para cumplir W &lt;= 16h es de aproximadamente 7.40 buques/día (~1.140 contenedores/día). La demanda actual (8.09 buques/día) supera esta cota y empuja al sistema a la zona hiperbólica de colas (W = 24.25 h).</w:t>
-      </w:r>
-    </w:p>
-    <w:p>
-      <w:r>
-        <w:t>• Con 4 Grúas STS: La capacidad se eleva y soporta la demanda actual de 8.09 buques/día con W = 16.46 horas (la espera en rada se reduce un 44.5%, de 16.32 h a 9.06 h).</w:t>
+        <w:t>La demanda diaria máxima soportable bajo la operación actual para cumplir W &lt;= 16h es de 7.40 buques/día. Con la 4ª grúa, la terminal puede absorber la demanda actual de 8.09 buques/día alcanzando W = 16.46 horas (la espera en rada cae un 44.5% a 9.06 h).</w:t>
       </w:r>
     </w:p>
     <w:p>
@@ -2426,7 +2536,7 @@
         <w:drawing>
           <wp:inline xmlns:a="http://schemas.openxmlformats.org/drawingml/2006/main" xmlns:pic="http://schemas.openxmlformats.org/drawingml/2006/picture">
             <wp:extent cx="5303520" cy="3241040"/>
-            <wp:docPr id="2" name="Picture 2"/>
+            <wp:docPr id="7" name="Picture 7"/>
             <wp:cNvGraphicFramePr>
               <a:graphicFrameLocks noChangeAspect="1"/>
             </wp:cNvGraphicFramePr>
@@ -2438,7 +2548,7 @@
                     <pic:cNvPicPr/>
                   </pic:nvPicPr>
                   <pic:blipFill>
-                    <a:blip r:embed="rId10"/>
+                    <a:blip r:embed="rId15"/>
                     <a:stretch>
                       <a:fillRect/>
                     </a:stretch>
@@ -2459,84 +2569,16 @@
     </w:p>
     <w:p>
       <w:pPr>
+        <w:spacing w:before="80" w:after="240"/>
         <w:jc w:val="center"/>
       </w:pPr>
       <w:r>
         <w:rPr>
           <w:i/>
+          <w:color w:val="505050"/>
           <w:sz w:val="17"/>
         </w:rPr>
-        <w:t>Figura 2: Capacidad Operativa y Cumplimiento del Umbral de 16h vs. Demanda Diaria</w:t>
-      </w:r>
-    </w:p>
-    <w:tbl>
-      <w:tblPr>
-        <w:tblW w:type="auto" w:w="0"/>
-        <w:jc w:val="center"/>
-        <w:tblLook w:firstColumn="1" w:firstRow="1" w:lastColumn="0" w:lastRow="0" w:noHBand="0" w:noVBand="1" w:val="04A0"/>
-      </w:tblPr>
-      <w:tblGrid>
-        <w:gridCol w:w="9360"/>
-      </w:tblGrid>
-      <w:tr>
-        <w:tc>
-          <w:tcPr>
-            <w:tcW w:type="dxa" w:w="9360"/>
-            <w:shd w:fill="EBF3FA"/>
-            <w:tcMar>
-              <w:top w:w="100" w:type="dxa"/>
-              <w:bottom w:w="100" w:type="dxa"/>
-              <w:left w:w="140" w:type="dxa"/>
-              <w:right w:w="140" w:type="dxa"/>
-            </w:tcMar>
-          </w:tcPr>
-          <w:p>
-            <w:pPr>
-              <w:spacing w:before="80" w:after="80"/>
-            </w:pPr>
-            <w:r>
-              <w:rPr>
-                <w:b/>
-                <w:color w:val="1F4E79"/>
-                <w:sz w:val="19"/>
-              </w:rPr>
-              <w:t xml:space="preserve">📌 DECISIÓN 4ª GRÚA: </w:t>
-            </w:r>
-            <w:r>
-              <w:rPr>
-                <w:i/>
-                <w:sz w:val="19"/>
-              </w:rPr>
-              <w:t>Recomendación: Aprobar la compra e instalación de la 4ª grúa pórtico. Como medidas operativas complementarias sin inversión de capital, se recomienda implementar el relevo de turnos 'en caliente' (eliminando la detención de 10-15 min) y mantener la 2ª grúa nocturna precalentada y operativa de forma continua (eliminando la espera de 15-20 min de alistamiento).</w:t>
-            </w:r>
-          </w:p>
-        </w:tc>
-      </w:tr>
-    </w:tbl>
-    <w:p>
-      <w:pPr>
-        <w:spacing w:after="120"/>
-      </w:pPr>
-    </w:p>
-    <w:p>
-      <w:pPr>
-        <w:pStyle w:val="Heading2"/>
-      </w:pPr>
-      <w:r>
-        <w:rPr>
-          <w:color w:val="2F5597"/>
-        </w:rPr>
-        <w:t>Consigna d: Política de Ventanas Horarias de Camiones y Slots Reefer</w:t>
-      </w:r>
-    </w:p>
-    <w:p>
-      <w:r>
-        <w:t>• Ventanas de Camiones: La penalización económica por arribo tardío reduce la proporción de camiones fuera de ventana del 25% al 10%. Esto estabiliza la ocupación del patio por debajo de los 2.000 slots y elimina los cuellos de botella donde la ocupación supera el 75% (&gt;2.250 slots). Por el contrario, ampliar la ventana aumenta la variabilidad de llegadas y congestiona la playa de estacionamiento.</w:t>
-      </w:r>
-    </w:p>
-    <w:p>
-      <w:r>
-        <w:t>• Segregación de Slots Reefer: El análisis de datos demostró que en los meses 10 a 12 (octubre a diciembre) la demanda de contenedores refrigerados se dispara un +57% (de 29.2 a 45.9 reefer/buque) por la cosecha de frutas. Reservar slots electrificados dedicados exclusivamente a reefer evita maniobras de remoción interna (re-handling) y agiliza las conexiones de frío.</w:t>
+        <w:t>Figura 7: Capacidad Operativa y Cumplimiento del Umbral de 16h vs. Demanda Diaria</w:t>
       </w:r>
     </w:p>
     <w:p>
@@ -2547,27 +2589,12 @@
         <w:rPr>
           <w:color w:val="2F5597"/>
         </w:rPr>
-        <w:t>Consigna e: Temporada de Cruceros y Reserva Exclusiva de Berma</w:t>
+        <w:t>Consigna d: Política de Patio y Camiones</w:t>
       </w:r>
     </w:p>
     <w:p>
       <w:r>
-        <w:t>• Impacto Operativo: Cada crucero ocupa una berma completa entre 28 y 36 horas sin usar grúas pórtico. Con 2 escalas por semana durante 3 meses (24 escalas), conceder la reserva exclusiva reduce transitoriamente las bermas disponibles para carga de 3 a 2. Esto dispara la estadía de los buques feeder en +12.88 horas por buque.</w:t>
-      </w:r>
-    </w:p>
-    <w:p>
-      <w:r>
-        <w:t>• Análisis Económico: Las demoras adicionales a la flota de carga totalizan 38.012 horas-buque al año. Valuando el costo de inmovilización entre USD 15.000 y 30.000 / día (USD 625 a 1.250 / h), el costo económico trasladado a las navieras de carga asciende a USD 23.757.490 - USD 47.514.980 por temporada. El consorcio planea percibir USD 60.000 por escala (USD 1.440.000 en total).</w:t>
-      </w:r>
-    </w:p>
-    <w:p>
-      <w:r>
-        <w:t>• Canon Compensatorio: Para no perder dinero frente a los daños a las navieras de carga, el canon de crucero debería fijarse entre USD 989.895 y USD 1.979.791 por escala (entre 16 y 33 veces lo ofrecido).</w:t>
-      </w:r>
-    </w:p>
-    <w:p>
-      <w:r>
-        <w:t>• Tratamiento Estadístico: Las escalas de cruceros DEBEN reportarse por separado de las estadísticas de los feeders. Los cruceros permanecen 32h por excursiones turísticas; mezclar sus horas con buques portacontenedores distorsionaría las métricas contractuales e induciría el desvío de líneas regulares al puerto capital.</w:t>
+        <w:t>Penalizar la impuntualidad de camiones reduce la tasa de tardíos del 25% al 10%, evitando superar el 75% del patio (&gt;2.250 slots) en momentos pico. La segregación de slots reefer es imprescindible durante octubre a diciembre, donde la demanda de frío sube un +57%.</w:t>
       </w:r>
     </w:p>
     <w:p>
@@ -2578,82 +2605,29 @@
         <w:rPr>
           <w:color w:val="2F5597"/>
         </w:rPr>
-        <w:t>Consigna f: Proyecto Industrial y Criterios de Decisión bajo Incertidumbre</w:t>
+        <w:t>Consigna e: Temporada de Cruceros y Reserva Exclusiva</w:t>
       </w:r>
     </w:p>
     <w:p>
       <w:r>
-        <w:t>El proyecto industrial prevé dos escenarios: Base (+35% demanda, 10.92 buques/día) y Optimista (+100% demanda, 16.17 buques/día). Dado que la capacidad física de 3 bermas es de ~9.6 buques/día, ante cualquiera de los dos escenarios la infraestructura actual COLAPSA con colas infinitas (rho &gt; 1.13).</w:t>
+        <w:t>Conceder la reserva exclusiva añade +12.88 horas de demora por buque a la carga, generando sobrecostos de inmovilización de USD 23.8M a USD 47.5M. El canon compensatorio debería ser de USD 990k a USD 1.98M por escala (frente a USD 60k ofrecidos). Se debe rechazar la exclusividad y reportar los cruceros por separado.</w:t>
+      </w:r>
+    </w:p>
+    <w:p>
+      <w:pPr>
+        <w:pStyle w:val="Heading2"/>
+      </w:pPr>
+      <w:r>
+        <w:rPr>
+          <w:color w:val="2F5597"/>
+        </w:rPr>
+        <w:t>Consigna f: Proyecto Industrial y Criterios bajo Incertidumbre</w:t>
       </w:r>
     </w:p>
     <w:p>
       <w:r>
-        <w:t>Se aplicaron los criterios de decisión bajo incertidumbre pura para evaluar si invertir en la 4ª berma:</w:t>
+        <w:t>Bajo los escenarios Base (+35%) y Optimista (+100%), las 3 bermas colapsan (rho &gt; 1.13). Construir la 4ª berma domina bajo todos los criterios de incertidumbre (Wald: +USD 47.8M vs -USD 1.200M; Savage Regret: USD 0M vs USD 850M). La convicción de la gerencia valida la urgencia de la obra.</w:t>
       </w:r>
-    </w:p>
-    <w:p>
-      <w:r>
-        <w:t>• Wald (Maximin / Pesimista): La peor consecuencia de Mantener 3 Bermas es el colapso masivo (-USD 1.200M), mientras que para Construir 4ª Berma es un beneficio neto de +USD 47.8M. Decisión: Construir 4ª Berma.</w:t>
-      </w:r>
-    </w:p>
-    <w:p>
-      <w:r>
-        <w:t>• Savage (Minimax Regret): El arrepentimiento máximo de no invertir si se materializa el proyecto industrial es de USD 850M a USD 1.200M. El arrepentimiento de invertir es USD 0M (estrategia dominante). Decisión: Construir 4ª Berma.</w:t>
-      </w:r>
-    </w:p>
-    <w:p>
-      <w:r>
-        <w:t>• Hurwicz (alfa = 0.5) y Laplace (Equiprobable): Construir 4ª Berma arroja valores esperados de +USD 248.9M y +USD 282.6M, frente a pérdidas de -USD 600M y -USD 567M de no invertir.</w:t>
-      </w:r>
-    </w:p>
-    <w:tbl>
-      <w:tblPr>
-        <w:tblW w:type="auto" w:w="0"/>
-        <w:jc w:val="center"/>
-        <w:tblLook w:firstColumn="1" w:firstRow="1" w:lastColumn="0" w:lastRow="0" w:noHBand="0" w:noVBand="1" w:val="04A0"/>
-      </w:tblPr>
-      <w:tblGrid>
-        <w:gridCol w:w="9360"/>
-      </w:tblGrid>
-      <w:tr>
-        <w:tc>
-          <w:tcPr>
-            <w:tcW w:type="dxa" w:w="9360"/>
-            <w:shd w:fill="EBF3FA"/>
-            <w:tcMar>
-              <w:top w:w="100" w:type="dxa"/>
-              <w:bottom w:w="100" w:type="dxa"/>
-              <w:left w:w="140" w:type="dxa"/>
-              <w:right w:w="140" w:type="dxa"/>
-            </w:tcMar>
-          </w:tcPr>
-          <w:p>
-            <w:pPr>
-              <w:spacing w:before="80" w:after="80"/>
-            </w:pPr>
-            <w:r>
-              <w:rPr>
-                <w:b/>
-                <w:color w:val="1F4E79"/>
-                <w:sz w:val="19"/>
-              </w:rPr>
-              <w:t xml:space="preserve">📌 CRITERIO DE DECISIÓN FORMAL: </w:t>
-            </w:r>
-            <w:r>
-              <w:rPr>
-                <w:i/>
-                <w:sz w:val="19"/>
-              </w:rPr>
-              <w:t>La convicción del directorio respecto a que el escenario base se materializará es formalmente irrelevante en criterios de incertidumbre no probabilística, pero ratifica plenamente la conveniencia de invertir en la 4ª berma, la cual es una alternativa estrictamente dominante en todas las condiciones posibles.</w:t>
-            </w:r>
-          </w:p>
-        </w:tc>
-      </w:tr>
-    </w:tbl>
-    <w:p>
-      <w:pPr>
-        <w:spacing w:after="120"/>
-      </w:pPr>
     </w:p>
     <w:p>
       <w:pPr>
@@ -2668,22 +2642,7 @@
     </w:p>
     <w:p>
       <w:r>
-        <w:t>• Inversión: USD 12.000.000 (Vida útil: 20 años). Costo de inmovilización: USD 15.000 a USD 30.000 / día (media USD 22.500/día).</w:t>
-      </w:r>
-    </w:p>
-    <w:p>
-      <w:r>
-        <w:t>• Demora evitada: Incorporar la 4ª berma reduce la estadía en 17.71 horas por buque. Para los 2.951 buques/año actuales, representa un ahorro de 52.260 horas-buque/año = 5.97 años-buque de inmovilización evitados al año.</w:t>
-      </w:r>
-    </w:p>
-    <w:p>
-      <w:r>
-        <w:t>• Ahorro económico anual: USD 48.99 Millones/año (rango: USD 32.7M a 65.3M/año).</w:t>
-      </w:r>
-    </w:p>
-    <w:p>
-      <w:r>
-        <w:t>• Período de Repago (Payback): Payback = USD 12M / USD 48.99M/año = 0.24 años (~2.9 meses). Rango: 2.2 a 4.4 meses.</w:t>
+        <w:t>La 4ª berma ahorra 17.71 horas por buque = 5.97 años-buque de inmovilización evitados al año = USD 48.99 Millones/año de ahorro. El período de repago es de 0.24 años (~2.9 meses).</w:t>
       </w:r>
     </w:p>
     <w:p>
@@ -2691,7 +2650,7 @@
         <w:drawing>
           <wp:inline xmlns:a="http://schemas.openxmlformats.org/drawingml/2006/main" xmlns:pic="http://schemas.openxmlformats.org/drawingml/2006/picture">
             <wp:extent cx="5303520" cy="3119718"/>
-            <wp:docPr id="3" name="Picture 3"/>
+            <wp:docPr id="8" name="Picture 8"/>
             <wp:cNvGraphicFramePr>
               <a:graphicFrameLocks noChangeAspect="1"/>
             </wp:cNvGraphicFramePr>
@@ -2703,7 +2662,7 @@
                     <pic:cNvPicPr/>
                   </pic:nvPicPr>
                   <pic:blipFill>
-                    <a:blip r:embed="rId11"/>
+                    <a:blip r:embed="rId16"/>
                     <a:stretch>
                       <a:fillRect/>
                     </a:stretch>
@@ -2724,19 +2683,16 @@
     </w:p>
     <w:p>
       <w:pPr>
+        <w:spacing w:before="80" w:after="240"/>
         <w:jc w:val="center"/>
       </w:pPr>
       <w:r>
         <w:rPr>
           <w:i/>
+          <w:color w:val="505050"/>
           <w:sz w:val="17"/>
         </w:rPr>
-        <w:t>Figura 3: Período de Repago de la Inversión en 4ª Berma (USD 12M) vs. Costo de Inmovilización</w:t>
-      </w:r>
-    </w:p>
-    <w:p>
-      <w:r>
-        <w:br w:type="page"/>
+        <w:t>Figura 8: Período de Repago de la Inversión en 4ª Berma (USD 12M) vs. Costo de Inmovilización</w:t>
       </w:r>
     </w:p>
     <w:p>
@@ -2752,7 +2708,7 @@
     </w:p>
     <w:p>
       <w:r>
-        <w:t>Para certificar con rigor científico que las diferencias observadas entre configuraciones no son artefactos del azar muestral, se realizó un Test de Comparaciones Múltiples de Tukey HSD (FWER = 0.05) sobre 1.500 réplicas por escenario:</w:t>
+        <w:t>Se certificó la significancia estadística mediante el Test de Tukey HSD (FWER = 0.05):</w:t>
       </w:r>
     </w:p>
     <w:tbl>
@@ -3403,7 +3359,7 @@
         <w:drawing>
           <wp:inline xmlns:a="http://schemas.openxmlformats.org/drawingml/2006/main" xmlns:pic="http://schemas.openxmlformats.org/drawingml/2006/picture">
             <wp:extent cx="5303520" cy="2828544"/>
-            <wp:docPr id="4" name="Picture 4"/>
+            <wp:docPr id="9" name="Picture 9"/>
             <wp:cNvGraphicFramePr>
               <a:graphicFrameLocks noChangeAspect="1"/>
             </wp:cNvGraphicFramePr>
@@ -3415,7 +3371,7 @@
                     <pic:cNvPicPr/>
                   </pic:nvPicPr>
                   <pic:blipFill>
-                    <a:blip r:embed="rId12"/>
+                    <a:blip r:embed="rId17"/>
                     <a:stretch>
                       <a:fillRect/>
                     </a:stretch>
@@ -3436,14 +3392,16 @@
     </w:p>
     <w:p>
       <w:pPr>
+        <w:spacing w:before="80" w:after="240"/>
         <w:jc w:val="center"/>
       </w:pPr>
       <w:r>
         <w:rPr>
           <w:i/>
+          <w:color w:val="505050"/>
           <w:sz w:val="17"/>
         </w:rPr>
-        <w:t>Figura 4: Diagrama de Intervalos de Confianza al 95% del Test de Tukey HSD</w:t>
+        <w:t>Figura 9: Intervalos de Confianza al 95% del Test de Tukey HSD</w:t>
       </w:r>
     </w:p>
     <w:p>
@@ -3459,38 +3417,7 @@
     </w:p>
     <w:p>
       <w:r>
-        <w:t>Hoja de Ruta Recomendada a la Dirección del Consorcio:</w:t>
-      </w:r>
-    </w:p>
-    <w:p>
-      <w:r>
-        <w:t>1. Corto Plazo: Adquirir la 4ª grúa pórtico STS para normalizar la estadía en torno a 16.46 h y neutralizar la amenaza de éxodo de las navieras al puerto capital.</w:t>
-      </w:r>
-    </w:p>
-    <w:p>
-      <w:r>
-        <w:t>2. Inversión en Infraestructura: Ejecutar inmediatamente la construcción de la 4ª berma (USD 12M). Su período de repago de menos de 3 meses y el ahorro de 5.97 años-buque anuales la convierten en una inversión con retorno excepcional que protege al puerto ante el proyecto industrial.</w:t>
-      </w:r>
-    </w:p>
-    <w:p>
-      <w:r>
-        <w:t>3. Política Comercial de Cruceros: Rechazar la cláusula de reserva exclusiva. Ofrecer atraque condicional a disponibilidad de berma o condicionar la exclusividad a la entrada en operaciones de la 4ª berma.</w:t>
-      </w:r>
-    </w:p>
-    <w:p>
-      <w:r>
-        <w:t>4. Gestión de Turnos: Eliminar las paradas de guardia de 15 min mediante relevos de personal 'en caliente' y eliminar el alistamiento de la 2ª grúa nocturna.</w:t>
-      </w:r>
-    </w:p>
-    <w:p>
-      <w:pPr>
-        <w:pStyle w:val="Heading2"/>
-      </w:pPr>
-      <w:r>
-        <w:rPr>
-          <w:color w:val="2F5597"/>
-        </w:rPr>
-        <w:t>Librerías Utilizadas</w:t>
+        <w:t>Recomendaciones finales: 1) Incorporar la 4ª grúa de inmediato; 2) Invertir en la 4ª berma (repago en 3 meses); 3) Rechazar la reserva exclusiva de crucero; 4) Relevo en caliente de turnos y penalización de camiones tardíos.</w:t>
       </w:r>
     </w:p>
     <w:tbl>

</xml_diff>

<commit_message>
docs: Actualizar informe ejecutivo y modelo conceptual con metricas de fisica corregida (maniobras 1.5h, contencion real de gruas y 9 graficos integrados)
</commit_message>
<xml_diff>
--- a/INFORME_EJECUTIVO_PUERTO_SUR.docx
+++ b/INFORME_EJECUTIVO_PUERTO_SUR.docx
@@ -188,7 +188,7 @@
               <w:rPr>
                 <w:sz w:val="18"/>
               </w:rPr>
-              <w:t>PuertoSur_escalas_G08.csv (8.852 escalas registradas, ~3 años)</w:t>
+              <w:t>data/PuertoSur_escalas_G08.csv (8.852 escalas registradas, ~3 años)</w:t>
             </w:r>
           </w:p>
         </w:tc>
@@ -339,7 +339,7 @@
     </w:p>
     <w:p>
       <w:r>
-        <w:t>A continuación se presenta la tabla consolidada con las respuestas cuantitativas y recomendaciones estratégicas a cada una de las consignas requeridas por la cátedra para el Grupo 08:</w:t>
+        <w:t>A continuación se presenta la tabla consolidada con las respuestas cuantitativas y recomendaciones estratégicas a cada una de las consignas requeridas por la cátedra para el Grupo 08 (Simulación Física Refactorizada):</w:t>
       </w:r>
     </w:p>
     <w:tbl>
@@ -513,7 +513,7 @@
               <w:rPr>
                 <w:sz w:val="18"/>
               </w:rPr>
-              <w:t>Simulador SimPy verificado formalmente mediante Ley de Little (L = lambda * W).</w:t>
+              <w:t>Simulador SimPy con contención física de grúas, maniobras conjuntas de 1.5h y dinámica de patio.</w:t>
             </w:r>
           </w:p>
         </w:tc>
@@ -533,7 +533,7 @@
               <w:rPr>
                 <w:sz w:val="18"/>
               </w:rPr>
-              <w:t>Arquitectura modular y reproducible.</w:t>
+              <w:t>Verificación formal mediante Ley de Little (L = lambda * W).</w:t>
             </w:r>
           </w:p>
         </w:tc>
@@ -592,7 +592,7 @@
               <w:rPr>
                 <w:sz w:val="18"/>
               </w:rPr>
-              <w:t>W = 24.25 h | L = 8.15 buques | Wq = 16.32 h (67.3%) | Ws = 7.92 h (32.7%). 58.1% excede 16h.</w:t>
+              <w:t>W = 15.00 h | L = 5.05 buques | Wq = 7.90 h (52.6%) | Ws = 7.11 h (47.4%). Atención neta grúa: 4.75 h (31.7%). 32.9% excede 16h.</w:t>
             </w:r>
           </w:p>
         </w:tc>
@@ -611,7 +611,7 @@
               <w:rPr>
                 <w:sz w:val="18"/>
               </w:rPr>
-              <w:t>Reclamo naviero plenamente fundado: 2 de cada 3 horas son espera en rada.</w:t>
+              <w:t>Reclamo naviero plenamente fundado: 58.3% del tiempo es espera inactiva.</w:t>
             </w:r>
           </w:p>
         </w:tc>
@@ -673,7 +673,7 @@
               <w:rPr>
                 <w:sz w:val="18"/>
               </w:rPr>
-              <w:t>Demanda máx actual: &lt;= 7.4 b/d. Con 4ª grúa: W cae a 16.46 h (espera en rada se reduce en 44.5%).</w:t>
+              <w:t>Demanda máx actual: &lt;= 8.09 b/d (32.9% excedido). Con 4ª grúa: W cae a 9.38 h (Wq cae 58.7% a 3.26 h; excedidos caen a 11.8%).</w:t>
             </w:r>
           </w:p>
         </w:tc>
@@ -693,7 +693,7 @@
               <w:rPr>
                 <w:sz w:val="18"/>
               </w:rPr>
-              <w:t>Aprobar de inmediato la 4ª grúa. Permite atender la demanda actual (8.09 b/d).</w:t>
+              <w:t>Aprobar de inmediato la 4ª grúa. Brinda holgura operativa y robustez.</w:t>
             </w:r>
           </w:p>
         </w:tc>
@@ -752,7 +752,7 @@
               <w:rPr>
                 <w:sz w:val="18"/>
               </w:rPr>
-              <w:t>Penalidades bajan camiones tardíos del 25% al 10%, evitando superar el 75% del patio.</w:t>
+              <w:t>Penalidades bajan camiones tardíos del 25% al 10%, estabilizando el patio por debajo del 75%.</w:t>
             </w:r>
           </w:p>
         </w:tc>
@@ -833,7 +833,7 @@
               <w:rPr>
                 <w:sz w:val="18"/>
               </w:rPr>
-              <w:t>Reserva exclusiva genera +12.88 h/buque de demora a carga (pérdidas de USD 23.8M a 47.5M).</w:t>
+              <w:t>Reserva exclusiva genera +2.31 h/buque de demora a carga (pérdidas de USD 4.26M a 8.52M).</w:t>
             </w:r>
           </w:p>
         </w:tc>
@@ -853,7 +853,7 @@
               <w:rPr>
                 <w:sz w:val="18"/>
               </w:rPr>
-              <w:t>Rechazar reserva exclusiva. Canon de equilibrio: USD 990k - 1.98M por escala. Reportar por separado.</w:t>
+              <w:t>Rechazar reserva exclusiva. Canon de equilibrio: USD 178k - 355k por escala. Reportar por separado.</w:t>
             </w:r>
           </w:p>
         </w:tc>
@@ -993,7 +993,7 @@
               <w:rPr>
                 <w:sz w:val="18"/>
               </w:rPr>
-              <w:t>Ahorro: 5.97 años-buque evitados/año (USD 49.0M/año). Inversión: USD 12M.</w:t>
+              <w:t>Ahorro: 2.53 años-buque evitados/año (USD 20.76M/año). Inversión: USD 12M.</w:t>
             </w:r>
           </w:p>
         </w:tc>
@@ -1013,7 +1013,7 @@
               <w:rPr>
                 <w:sz w:val="18"/>
               </w:rPr>
-              <w:t>Payback de 0.24 años (~3 meses). Rentabilidad económica sobresaliente.</w:t>
+              <w:t>Payback de 0.58 años (~7 meses). Rentabilidad económica sobresaliente.</w:t>
             </w:r>
           </w:p>
         </w:tc>
@@ -1053,7 +1053,7 @@
     </w:p>
     <w:p>
       <w:r>
-        <w:t>Se clasificaron rigurosamente las variables de decisión (Bermas B in {2,3,4}, Grúas G in {3,4}, políticas de camiones y cruceros), variables de referencia exógenas (arribos Delta t del Grupo 8, mix de carga, turnos, paradas de cambio de guardia) y variables de salida/KPIs (W, Wq, Ws, % espera, L, Lq y Payback).</w:t>
+        <w:t>Se clasificaron rigurosamente las variables de decisión (Bermas B in {2,3,4}, Grúas G in {3,4}, políticas de camiones y cruceros), variables de referencia exógenas (arribos Delta t del Grupo 8, mix de carga, turnos, maniobras conjuntas de 1.5h, paradas de cambio de guardia) y variables de salida/KPIs (W, Wq, Ws, T_esp_grua, T_op_grua, % espera inactiva, L, Lq y Payback).</w:t>
       </w:r>
     </w:p>
     <w:p>
@@ -1065,11 +1065,6 @@
           <w:color w:val="2F5597"/>
         </w:rPr>
         <w:t>1.2. Relación Causal entre Variables</w:t>
-      </w:r>
-    </w:p>
-    <w:p>
-      <w:r>
-        <w:t>A continuación se presenta el Diagrama de Relación Causal entre Variables de Decisión, Exógenas, Estado y Salidas:</w:t>
       </w:r>
     </w:p>
     <w:p>
@@ -1362,7 +1357,7 @@
     </w:p>
     <w:p>
       <w:r>
-        <w:t>Del análisis de las 8.852 escalas de PuertoSur_escalas_G08.csv se derivaron: lambda = 8.086 buques/día, tiempo entre arribos medio = 2.968 h (CV = 2.494), Austral Feeder (43.8%), Andes Container Line (37.6%), TransPatagonia Line (18.7%).</w:t>
+        <w:t>Del análisis de las 8.852 escalas de data/PuertoSur_escalas_G08.csv se derivaron: lambda = 8.086 buques/día, tiempo entre arribos medio = 2.968 h (CV = 2.494), Austral Feeder (43.8%), Andes Container Line (37.6%), TransPatagonia Line (18.7%).</w:t>
       </w:r>
     </w:p>
     <w:tbl>
@@ -1574,7 +1569,7 @@
               <w:rPr>
                 <w:sz w:val="18"/>
               </w:rPr>
-              <w:t>M/M/3 (Dual 2G)</w:t>
+              <w:t>M/M/3 (Ideal 2G)</w:t>
             </w:r>
           </w:p>
         </w:tc>
@@ -1594,7 +1589,7 @@
               <w:rPr>
                 <w:sz w:val="18"/>
               </w:rPr>
-              <w:t>6.35 h</w:t>
+              <w:t>5.50 h</w:t>
             </w:r>
           </w:p>
         </w:tc>
@@ -1614,7 +1609,7 @@
               <w:rPr>
                 <w:sz w:val="18"/>
               </w:rPr>
-              <w:t>0.1575</w:t>
+              <w:t>0.1818</w:t>
             </w:r>
           </w:p>
         </w:tc>
@@ -1634,7 +1629,7 @@
               <w:rPr>
                 <w:sz w:val="18"/>
               </w:rPr>
-              <w:t>0.713</w:t>
+              <w:t>0.618</w:t>
             </w:r>
           </w:p>
         </w:tc>
@@ -1654,7 +1649,7 @@
               <w:rPr>
                 <w:sz w:val="18"/>
               </w:rPr>
-              <w:t>3.78 h</w:t>
+              <w:t>1.76 h</w:t>
             </w:r>
           </w:p>
         </w:tc>
@@ -1674,7 +1669,7 @@
               <w:rPr>
                 <w:sz w:val="18"/>
               </w:rPr>
-              <w:t>10.13 h</w:t>
+              <w:t>7.26 h</w:t>
             </w:r>
           </w:p>
         </w:tc>
@@ -1694,7 +1689,7 @@
               <w:rPr>
                 <w:sz w:val="18"/>
               </w:rPr>
-              <w:t>3.41</w:t>
+              <w:t>2.45</w:t>
             </w:r>
           </w:p>
         </w:tc>
@@ -1734,7 +1729,7 @@
               <w:rPr>
                 <w:sz w:val="18"/>
               </w:rPr>
-              <w:t>7.00 h</w:t>
+              <w:t>6.50 h</w:t>
             </w:r>
           </w:p>
         </w:tc>
@@ -1753,7 +1748,7 @@
               <w:rPr>
                 <w:sz w:val="18"/>
               </w:rPr>
-              <w:t>0.1429</w:t>
+              <w:t>0.1538</w:t>
             </w:r>
           </w:p>
         </w:tc>
@@ -1772,7 +1767,7 @@
               <w:rPr>
                 <w:sz w:val="18"/>
               </w:rPr>
-              <w:t>0.786</w:t>
+              <w:t>0.730</w:t>
             </w:r>
           </w:p>
         </w:tc>
@@ -1791,7 +1786,7 @@
               <w:rPr>
                 <w:sz w:val="18"/>
               </w:rPr>
-              <w:t>6.81 h</w:t>
+              <w:t>4.34 h</w:t>
             </w:r>
           </w:p>
         </w:tc>
@@ -1810,7 +1805,7 @@
               <w:rPr>
                 <w:sz w:val="18"/>
               </w:rPr>
-              <w:t>13.81 h</w:t>
+              <w:t>10.84 h</w:t>
             </w:r>
           </w:p>
         </w:tc>
@@ -1829,7 +1824,7 @@
               <w:rPr>
                 <w:sz w:val="18"/>
               </w:rPr>
-              <w:t>4.65</w:t>
+              <w:t>3.65</w:t>
             </w:r>
           </w:p>
         </w:tc>
@@ -1871,7 +1866,7 @@
               <w:rPr>
                 <w:sz w:val="18"/>
               </w:rPr>
-              <w:t>7.50 h</w:t>
+              <w:t>7.11 h</w:t>
             </w:r>
           </w:p>
         </w:tc>
@@ -1891,7 +1886,7 @@
               <w:rPr>
                 <w:sz w:val="18"/>
               </w:rPr>
-              <w:t>0.1333</w:t>
+              <w:t>0.1406</w:t>
             </w:r>
           </w:p>
         </w:tc>
@@ -1911,7 +1906,7 @@
               <w:rPr>
                 <w:sz w:val="18"/>
               </w:rPr>
-              <w:t>0.842</w:t>
+              <w:t>0.799</w:t>
             </w:r>
           </w:p>
         </w:tc>
@@ -1931,7 +1926,7 @@
               <w:rPr>
                 <w:sz w:val="18"/>
               </w:rPr>
-              <w:t>11.37 h</w:t>
+              <w:t>7.85 h</w:t>
             </w:r>
           </w:p>
         </w:tc>
@@ -1951,7 +1946,7 @@
               <w:rPr>
                 <w:sz w:val="18"/>
               </w:rPr>
-              <w:t>18.87 h</w:t>
+              <w:t>14.96 h</w:t>
             </w:r>
           </w:p>
         </w:tc>
@@ -1971,7 +1966,7 @@
               <w:rPr>
                 <w:sz w:val="18"/>
               </w:rPr>
-              <w:t>6.36</w:t>
+              <w:t>5.04</w:t>
             </w:r>
           </w:p>
         </w:tc>
@@ -2011,7 +2006,7 @@
               <w:rPr>
                 <w:sz w:val="18"/>
               </w:rPr>
-              <w:t>7.00 h (CV=2.49)</w:t>
+              <w:t>7.11 h (CV=2.49)</w:t>
             </w:r>
           </w:p>
         </w:tc>
@@ -2030,7 +2025,7 @@
               <w:rPr>
                 <w:sz w:val="18"/>
               </w:rPr>
-              <w:t>0.1429</w:t>
+              <w:t>0.1406</w:t>
             </w:r>
           </w:p>
         </w:tc>
@@ -2049,7 +2044,7 @@
               <w:rPr>
                 <w:sz w:val="18"/>
               </w:rPr>
-              <w:t>0.786</w:t>
+              <w:t>0.799</w:t>
             </w:r>
           </w:p>
         </w:tc>
@@ -2068,7 +2063,7 @@
               <w:rPr>
                 <w:sz w:val="18"/>
               </w:rPr>
-              <w:t>21.50 h</w:t>
+              <w:t>24.81 h</w:t>
             </w:r>
           </w:p>
         </w:tc>
@@ -2087,7 +2082,7 @@
               <w:rPr>
                 <w:sz w:val="18"/>
               </w:rPr>
-              <w:t>28.50 h</w:t>
+              <w:t>31.92 h</w:t>
             </w:r>
           </w:p>
         </w:tc>
@@ -2106,7 +2101,7 @@
               <w:rPr>
                 <w:sz w:val="18"/>
               </w:rPr>
-              <w:t>9.60</w:t>
+              <w:t>10.75</w:t>
             </w:r>
           </w:p>
         </w:tc>
@@ -2128,7 +2123,7 @@
               <w:rPr>
                 <w:sz w:val="18"/>
               </w:rPr>
-              <w:t>M/G/3 (Allen-Cunneen)</w:t>
+              <w:t>Simulación Física G08</w:t>
             </w:r>
           </w:p>
         </w:tc>
@@ -2148,7 +2143,7 @@
               <w:rPr>
                 <w:sz w:val="18"/>
               </w:rPr>
-              <w:t>7.50 h (CV=2.49)</w:t>
+              <w:t>7.11 h (Empírico)</w:t>
             </w:r>
           </w:p>
         </w:tc>
@@ -2168,7 +2163,7 @@
               <w:rPr>
                 <w:sz w:val="18"/>
               </w:rPr>
-              <w:t>0.1333</w:t>
+              <w:t>Dinámico</w:t>
             </w:r>
           </w:p>
         </w:tc>
@@ -2188,7 +2183,7 @@
               <w:rPr>
                 <w:sz w:val="18"/>
               </w:rPr>
-              <w:t>0.842</w:t>
+              <w:t>~0.79</w:t>
             </w:r>
           </w:p>
         </w:tc>
@@ -2208,7 +2203,7 @@
               <w:rPr>
                 <w:sz w:val="18"/>
               </w:rPr>
-              <w:t>35.86 h</w:t>
+              <w:t>7.90 h</w:t>
             </w:r>
           </w:p>
         </w:tc>
@@ -2228,7 +2223,7 @@
               <w:rPr>
                 <w:sz w:val="18"/>
               </w:rPr>
-              <w:t>43.36 h</w:t>
+              <w:t>15.00 h</w:t>
             </w:r>
           </w:p>
         </w:tc>
@@ -2248,142 +2243,7 @@
               <w:rPr>
                 <w:sz w:val="18"/>
               </w:rPr>
-              <w:t>14.61</w:t>
-            </w:r>
-          </w:p>
-        </w:tc>
-      </w:tr>
-      <w:tr>
-        <w:tc>
-          <w:tcPr>
-            <w:tcW w:type="dxa" w:w="1337"/>
-            <w:tcMar>
-              <w:top w:w="60" w:type="dxa"/>
-              <w:bottom w:w="60" w:type="dxa"/>
-              <w:left w:w="100" w:type="dxa"/>
-              <w:right w:w="100" w:type="dxa"/>
-            </w:tcMar>
-          </w:tcPr>
-          <w:p>
-            <w:r>
-              <w:rPr>
-                <w:sz w:val="18"/>
-              </w:rPr>
-              <w:t>Simulación Real G08</w:t>
-            </w:r>
-          </w:p>
-        </w:tc>
-        <w:tc>
-          <w:tcPr>
-            <w:tcW w:type="dxa" w:w="1337"/>
-            <w:tcMar>
-              <w:top w:w="60" w:type="dxa"/>
-              <w:bottom w:w="60" w:type="dxa"/>
-              <w:left w:w="100" w:type="dxa"/>
-              <w:right w:w="100" w:type="dxa"/>
-            </w:tcMar>
-          </w:tcPr>
-          <w:p>
-            <w:r>
-              <w:rPr>
-                <w:sz w:val="18"/>
-              </w:rPr>
-              <w:t>7.92 h (Empírico)</w:t>
-            </w:r>
-          </w:p>
-        </w:tc>
-        <w:tc>
-          <w:tcPr>
-            <w:tcW w:type="dxa" w:w="1337"/>
-            <w:tcMar>
-              <w:top w:w="60" w:type="dxa"/>
-              <w:bottom w:w="60" w:type="dxa"/>
-              <w:left w:w="100" w:type="dxa"/>
-              <w:right w:w="100" w:type="dxa"/>
-            </w:tcMar>
-          </w:tcPr>
-          <w:p>
-            <w:r>
-              <w:rPr>
-                <w:sz w:val="18"/>
-              </w:rPr>
-              <w:t>Dinámico</w:t>
-            </w:r>
-          </w:p>
-        </w:tc>
-        <w:tc>
-          <w:tcPr>
-            <w:tcW w:type="dxa" w:w="1337"/>
-            <w:tcMar>
-              <w:top w:w="60" w:type="dxa"/>
-              <w:bottom w:w="60" w:type="dxa"/>
-              <w:left w:w="100" w:type="dxa"/>
-              <w:right w:w="100" w:type="dxa"/>
-            </w:tcMar>
-          </w:tcPr>
-          <w:p>
-            <w:r>
-              <w:rPr>
-                <w:sz w:val="18"/>
-              </w:rPr>
-              <w:t>~0.81</w:t>
-            </w:r>
-          </w:p>
-        </w:tc>
-        <w:tc>
-          <w:tcPr>
-            <w:tcW w:type="dxa" w:w="1337"/>
-            <w:tcMar>
-              <w:top w:w="60" w:type="dxa"/>
-              <w:bottom w:w="60" w:type="dxa"/>
-              <w:left w:w="100" w:type="dxa"/>
-              <w:right w:w="100" w:type="dxa"/>
-            </w:tcMar>
-          </w:tcPr>
-          <w:p>
-            <w:r>
-              <w:rPr>
-                <w:sz w:val="18"/>
-              </w:rPr>
-              <w:t>16.32 h</w:t>
-            </w:r>
-          </w:p>
-        </w:tc>
-        <w:tc>
-          <w:tcPr>
-            <w:tcW w:type="dxa" w:w="1337"/>
-            <w:tcMar>
-              <w:top w:w="60" w:type="dxa"/>
-              <w:bottom w:w="60" w:type="dxa"/>
-              <w:left w:w="100" w:type="dxa"/>
-              <w:right w:w="100" w:type="dxa"/>
-            </w:tcMar>
-          </w:tcPr>
-          <w:p>
-            <w:r>
-              <w:rPr>
-                <w:sz w:val="18"/>
-              </w:rPr>
-              <w:t>24.25 h</w:t>
-            </w:r>
-          </w:p>
-        </w:tc>
-        <w:tc>
-          <w:tcPr>
-            <w:tcW w:type="dxa" w:w="1337"/>
-            <w:tcMar>
-              <w:top w:w="60" w:type="dxa"/>
-              <w:bottom w:w="60" w:type="dxa"/>
-              <w:left w:w="100" w:type="dxa"/>
-              <w:right w:w="100" w:type="dxa"/>
-            </w:tcMar>
-          </w:tcPr>
-          <w:p>
-            <w:r>
-              <w:rPr>
-                <w:sz w:val="18"/>
-              </w:rPr>
-              <w:t>8.15</w:t>
+              <w:t>5.05</w:t>
             </w:r>
           </w:p>
         </w:tc>
@@ -2427,7 +2287,7 @@
                 <w:i/>
                 <w:sz w:val="19"/>
               </w:rPr>
-              <w:t>El resultado empírico de la simulación (W = 24.25 h) valida plenamente el modelo conceptual al ubicarse entre el M/M/3 ideal (18.87 h) y el modelo conservador de Allen-Cunneen (28.50 a 43.36 h).</w:t>
+              <w:t>Con las maniobras conjuntas de 1.5h corregidas, el modelo M/M/3 analítico con Ws = 7.11h predice Wq = 7.85h y W = 14.96h, coincidiendo de forma casi exacta con la simulación real (Wq = 7.90h, W = 15.00h).</w:t>
             </w:r>
           </w:p>
         </w:tc>
@@ -2462,7 +2322,12 @@
     </w:p>
     <w:p>
       <w:r>
-        <w:t>La operación actual promedia W = 24.25 horas, con Wq = 16.32 horas (67.33% espera) y Ws = 7.92 horas (32.67% atención). L = 8.15 buques. El 58.10% de las escalas supera el límite de 16 horas. El reclamo de las navieras es totalmente fundado.</w:t>
+        <w:t>La operación actual promedia W = 15.00 horas, con Wq = 7.90 horas (52.62% espera en rada) y Ws = 7.11 horas (47.38% en berma). De Ws: 4.75 h son atención efectiva de grúa (31.67%), 0.86 h son espera por grúa libre amarrado (5.73%) y 1.50 h son maniobras náuticas conjuntas (10.00%). La espera total inactiva suma 58.35%.</w:t>
+      </w:r>
+    </w:p>
+    <w:p>
+      <w:r>
+        <w:t>Aunque el promedio cumple con 15.00h, el 32.91% de las escalas excede las 16 horas (en TransPatagonia Line excede el 45.10%).</w:t>
       </w:r>
     </w:p>
     <w:p>
@@ -2528,7 +2393,7 @@
     </w:p>
     <w:p>
       <w:r>
-        <w:t>La demanda diaria máxima soportable bajo la operación actual para cumplir W &lt;= 16h es de 7.40 buques/día. Con la 4ª grúa, la terminal puede absorber la demanda actual de 8.09 buques/día alcanzando W = 16.46 horas (la espera en rada cae un 44.5% a 9.06 h).</w:t>
+        <w:t>Con la 4ª grúa, la estadía total cae a 9.38 horas (reducción de 37.5%). La espera en rada se contrae un 58.7% (de 7.90 h a 3.26 h), y el incumplimiento cae de 32.91% a tan solo 11.85%. A 8.09 buques/día, la 4ª grúa garantiza que el puerto opere con total holgura.</w:t>
       </w:r>
     </w:p>
     <w:p>
@@ -2594,7 +2459,7 @@
     </w:p>
     <w:p>
       <w:r>
-        <w:t>Penalizar la impuntualidad de camiones reduce la tasa de tardíos del 25% al 10%, evitando superar el 75% del patio (&gt;2.250 slots) en momentos pico. La segregación de slots reefer es imprescindible durante octubre a diciembre, donde la demanda de frío sube un +57%.</w:t>
+        <w:t>Penalizar la impuntualidad de camiones reduce la tasa de tardíos del 25% al 10%, estabilizando el patio por debajo del 75% (&gt;2.250 slots) en momentos pico. La segregación de slots reefer es imprescindible durante octubre a diciembre, donde la demanda de frío sube un +57%.</w:t>
       </w:r>
     </w:p>
     <w:p>
@@ -2610,7 +2475,7 @@
     </w:p>
     <w:p>
       <w:r>
-        <w:t>Conceder la reserva exclusiva añade +12.88 horas de demora por buque a la carga, generando sobrecostos de inmovilización de USD 23.8M a USD 47.5M. El canon compensatorio debería ser de USD 990k a USD 1.98M por escala (frente a USD 60k ofrecidos). Se debe rechazar la exclusividad y reportar los cruceros por separado.</w:t>
+        <w:t>Conceder la reserva exclusiva añade +2.31 horas de demora por buque a la carga, generando demoras de 6.820 h/año con pérdidas de inmovilización de USD 4.26M a USD 8.52M por temporada. El canon compensatorio debería ser de USD 178k a USD 355k por escala (vs USD 60k ofrecidos). Se debe rechazar la exclusividad y reportar los cruceros por separado.</w:t>
       </w:r>
     </w:p>
     <w:p>
@@ -2626,7 +2491,7 @@
     </w:p>
     <w:p>
       <w:r>
-        <w:t>Bajo los escenarios Base (+35%) y Optimista (+100%), las 3 bermas colapsan (rho &gt; 1.13). Construir la 4ª berma domina bajo todos los criterios de incertidumbre (Wald: +USD 47.8M vs -USD 1.200M; Savage Regret: USD 0M vs USD 850M). La convicción de la gerencia valida la urgencia de la obra.</w:t>
+        <w:t>Bajo los escenarios Base (+35%) y Optimista (+100%), las 3 bermas colapsan (rho &gt; 1.13). Construir la 4ª berma domina bajo todos los criterios de incertidumbre (Wald: +USD 19.5M vs -USD 1.200M; Savage Regret: USD 0M vs USD 750M). La convicción de la gerencia valida la urgencia de la obra.</w:t>
       </w:r>
     </w:p>
     <w:p>
@@ -2642,7 +2507,7 @@
     </w:p>
     <w:p>
       <w:r>
-        <w:t>La 4ª berma ahorra 17.71 horas por buque = 5.97 años-buque de inmovilización evitados al año = USD 48.99 Millones/año de ahorro. El período de repago es de 0.24 años (~2.9 meses).</w:t>
+        <w:t>La 4ª berma ahorra 7.50 horas por buque = 2.53 años-buque de inmovilización evitados al año = USD 20.76 Millones/año de ahorro. El período de repago es de 0.58 años (~6.9 meses).</w:t>
       </w:r>
     </w:p>
     <w:p>
@@ -2914,7 +2779,7 @@
               <w:rPr>
                 <w:sz w:val="18"/>
               </w:rPr>
-              <w:t>-8.30 h</w:t>
+              <w:t>-4.33 h</w:t>
             </w:r>
           </w:p>
         </w:tc>
@@ -2954,7 +2819,7 @@
               <w:rPr>
                 <w:sz w:val="18"/>
               </w:rPr>
-              <w:t>-9.72 h</w:t>
+              <w:t>-5.11 h</w:t>
             </w:r>
           </w:p>
         </w:tc>
@@ -2974,7 +2839,7 @@
               <w:rPr>
                 <w:sz w:val="18"/>
               </w:rPr>
-              <w:t>-6.88 h</w:t>
+              <w:t>-3.55 h</w:t>
             </w:r>
           </w:p>
         </w:tc>
@@ -3034,7 +2899,7 @@
               <w:rPr>
                 <w:sz w:val="18"/>
               </w:rPr>
-              <w:t>+24.08 h</w:t>
+              <w:t>+5.15 h</w:t>
             </w:r>
           </w:p>
         </w:tc>
@@ -3072,7 +2937,7 @@
               <w:rPr>
                 <w:sz w:val="18"/>
               </w:rPr>
-              <w:t>+22.66 h</w:t>
+              <w:t>+4.37 h</w:t>
             </w:r>
           </w:p>
         </w:tc>
@@ -3091,7 +2956,7 @@
               <w:rPr>
                 <w:sz w:val="18"/>
               </w:rPr>
-              <w:t>+25.50 h</w:t>
+              <w:t>+5.93 h</w:t>
             </w:r>
           </w:p>
         </w:tc>
@@ -3152,7 +3017,7 @@
               <w:rPr>
                 <w:sz w:val="18"/>
               </w:rPr>
-              <w:t>-1.05 h</w:t>
+              <w:t>+0.34 h</w:t>
             </w:r>
           </w:p>
         </w:tc>
@@ -3172,7 +3037,7 @@
               <w:rPr>
                 <w:sz w:val="18"/>
               </w:rPr>
-              <w:t>0.228</w:t>
+              <w:t>0.677</w:t>
             </w:r>
           </w:p>
         </w:tc>
@@ -3192,7 +3057,7 @@
               <w:rPr>
                 <w:sz w:val="18"/>
               </w:rPr>
-              <w:t>-2.47 h</w:t>
+              <w:t>-0.44 h</w:t>
             </w:r>
           </w:p>
         </w:tc>
@@ -3212,7 +3077,7 @@
               <w:rPr>
                 <w:sz w:val="18"/>
               </w:rPr>
-              <w:t>+0.37 h</w:t>
+              <w:t>+1.12 h</w:t>
             </w:r>
           </w:p>
         </w:tc>
@@ -3272,7 +3137,7 @@
               <w:rPr>
                 <w:sz w:val="18"/>
               </w:rPr>
-              <w:t>+32.38 h</w:t>
+              <w:t>+9.48 h</w:t>
             </w:r>
           </w:p>
         </w:tc>
@@ -3310,7 +3175,7 @@
               <w:rPr>
                 <w:sz w:val="18"/>
               </w:rPr>
-              <w:t>+30.96 h</w:t>
+              <w:t>+8.70 h</w:t>
             </w:r>
           </w:p>
         </w:tc>
@@ -3329,7 +3194,7 @@
               <w:rPr>
                 <w:sz w:val="18"/>
               </w:rPr>
-              <w:t>+33.79 h</w:t>
+              <w:t>+10.26 h</w:t>
             </w:r>
           </w:p>
         </w:tc>
@@ -3417,7 +3282,7 @@
     </w:p>
     <w:p>
       <w:r>
-        <w:t>Recomendaciones finales: 1) Incorporar la 4ª grúa de inmediato; 2) Invertir en la 4ª berma (repago en 3 meses); 3) Rechazar la reserva exclusiva de crucero; 4) Relevo en caliente de turnos y penalización de camiones tardíos.</w:t>
+        <w:t>Recomendaciones finales: 1) Incorporar la 4ª grúa de inmediato; 2) Invertir en la 4ª berma (repago en ~7 meses); 3) Rechazar la reserva exclusiva de crucero; 4) Relevo en caliente de turnos y penalización de camiones tardíos.</w:t>
       </w:r>
     </w:p>
     <w:tbl>

</xml_diff>

<commit_message>
docs: consolidar modelo conceptual con teoria IO51, maniobras 1.5h, exportar word y agregar assets de catedra
</commit_message>
<xml_diff>
--- a/INFORME_EJECUTIVO_PUERTO_SUR.docx
+++ b/INFORME_EJECUTIVO_PUERTO_SUR.docx
@@ -61,7 +61,7 @@
         <w:tc>
           <w:tcPr>
             <w:tcW w:type="dxa" w:w="4680"/>
-            <w:shd w:fill="2F5597"/>
+            <w:shd w:fill="1F4E79"/>
             <w:tcMar>
               <w:top w:w="100" w:type="dxa"/>
               <w:bottom w:w="100" w:type="dxa"/>
@@ -86,7 +86,7 @@
         <w:tc>
           <w:tcPr>
             <w:tcW w:type="dxa" w:w="4680"/>
-            <w:shd w:fill="2F5597"/>
+            <w:shd w:fill="1F4E79"/>
             <w:tcMar>
               <w:top w:w="100" w:type="dxa"/>
               <w:bottom w:w="100" w:type="dxa"/>
@@ -169,7 +169,7 @@
                 <w:b/>
                 <w:sz w:val="18"/>
               </w:rPr>
-              <w:t>Dataset Asignado:</w:t>
+              <w:t>Integrantes:</w:t>
             </w:r>
           </w:p>
         </w:tc>
@@ -188,7 +188,7 @@
               <w:rPr>
                 <w:sz w:val="18"/>
               </w:rPr>
-              <w:t>PuertoSur_escalas_G08.csv (8.852 escalas registradas, ~3 años)</w:t>
+              <w:t>Bautista Fanelli, Santiago Montiel, Benjamín ...</w:t>
             </w:r>
           </w:p>
         </w:tc>
@@ -211,7 +211,7 @@
                 <w:b/>
                 <w:sz w:val="18"/>
               </w:rPr>
-              <w:t>Entorno y Lenguaje:</w:t>
+              <w:t>Dataset Asignado:</w:t>
             </w:r>
           </w:p>
         </w:tc>
@@ -231,7 +231,7 @@
               <w:rPr>
                 <w:sz w:val="18"/>
               </w:rPr>
-              <w:t>Python 3.12 / SimPy 4.1.2 / Pandas / SciPy / Statsmodels / Matplotlib</w:t>
+              <w:t>PuertoSur_escalas_G08.csv (8.852 escalas registradas, ~3 años)</w:t>
             </w:r>
           </w:p>
         </w:tc>
@@ -253,7 +253,7 @@
                 <w:b/>
                 <w:sz w:val="18"/>
               </w:rPr>
-              <w:t>Repositorio Oficial:</w:t>
+              <w:t>Entorno y Lenguaje:</w:t>
             </w:r>
           </w:p>
         </w:tc>
@@ -272,7 +272,7 @@
               <w:rPr>
                 <w:sz w:val="18"/>
               </w:rPr>
-              <w:t>https://github.com/Santim1897/TP2-IO</w:t>
+              <w:t>Python 3.12 / SimPy 4.1.2 / Pandas / SciPy / Statsmodels / Matplotlib</w:t>
             </w:r>
           </w:p>
         </w:tc>
@@ -295,6 +295,48 @@
                 <w:b/>
                 <w:sz w:val="18"/>
               </w:rPr>
+              <w:t>Repositorio Oficial:</w:t>
+            </w:r>
+          </w:p>
+        </w:tc>
+        <w:tc>
+          <w:tcPr>
+            <w:tcW w:type="dxa" w:w="4680"/>
+            <w:shd w:fill="F2F5F9"/>
+            <w:tcMar>
+              <w:top w:w="60" w:type="dxa"/>
+              <w:bottom w:w="60" w:type="dxa"/>
+              <w:left w:w="100" w:type="dxa"/>
+              <w:right w:w="100" w:type="dxa"/>
+            </w:tcMar>
+          </w:tcPr>
+          <w:p>
+            <w:r>
+              <w:rPr>
+                <w:sz w:val="18"/>
+              </w:rPr>
+              <w:t>https://github.com/Santim1897/TP2-IO</w:t>
+            </w:r>
+          </w:p>
+        </w:tc>
+      </w:tr>
+      <w:tr>
+        <w:tc>
+          <w:tcPr>
+            <w:tcW w:type="dxa" w:w="4680"/>
+            <w:tcMar>
+              <w:top w:w="60" w:type="dxa"/>
+              <w:bottom w:w="60" w:type="dxa"/>
+              <w:left w:w="100" w:type="dxa"/>
+              <w:right w:w="100" w:type="dxa"/>
+            </w:tcMar>
+          </w:tcPr>
+          <w:p>
+            <w:r>
+              <w:rPr>
+                <w:b/>
+                <w:sz w:val="18"/>
+              </w:rPr>
               <w:t>Naturaleza del Documento:</w:t>
             </w:r>
           </w:p>
@@ -302,7 +344,6 @@
         <w:tc>
           <w:tcPr>
             <w:tcW w:type="dxa" w:w="4680"/>
-            <w:shd w:fill="F2F5F9"/>
             <w:tcMar>
               <w:top w:w="60" w:type="dxa"/>
               <w:bottom w:w="60" w:type="dxa"/>
@@ -334,742 +375,12 @@
         <w:rPr>
           <w:color w:val="1F4E79"/>
         </w:rPr>
-        <w:t>Resumen Ejecutivo y Cuadro Consolidado de Respuestas</w:t>
+        <w:t>Sección 1: Modelo Conceptual Formal</w:t>
       </w:r>
     </w:p>
     <w:p>
       <w:r>
-        <w:t>A continuación se presenta la tabla consolidada con las respuestas cuantitativas y recomendaciones estratégicas a cada una de las consignas requeridas por la cátedra para el Grupo 08:</w:t>
-      </w:r>
-    </w:p>
-    <w:tbl>
-      <w:tblPr>
-        <w:tblW w:type="auto" w:w="0"/>
-        <w:jc w:val="center"/>
-        <w:tblLook w:firstColumn="1" w:firstRow="1" w:lastColumn="0" w:lastRow="0" w:noHBand="0" w:noVBand="1" w:val="04A0"/>
-      </w:tblPr>
-      <w:tblGrid>
-        <w:gridCol w:w="2340"/>
-        <w:gridCol w:w="2340"/>
-        <w:gridCol w:w="2340"/>
-        <w:gridCol w:w="2340"/>
-      </w:tblGrid>
-      <w:tr>
-        <w:tc>
-          <w:tcPr>
-            <w:tcW w:type="dxa" w:w="2340"/>
-            <w:shd w:fill="1F4E79"/>
-            <w:tcMar>
-              <w:top w:w="100" w:type="dxa"/>
-              <w:bottom w:w="100" w:type="dxa"/>
-              <w:left w:w="120" w:type="dxa"/>
-              <w:right w:w="120" w:type="dxa"/>
-            </w:tcMar>
-          </w:tcPr>
-          <w:p>
-            <w:pPr>
-              <w:jc w:val="center"/>
-            </w:pPr>
-            <w:r>
-              <w:rPr>
-                <w:b/>
-                <w:color w:val="FFFFFF"/>
-                <w:sz w:val="19"/>
-              </w:rPr>
-              <w:t>Consigna</w:t>
-            </w:r>
-          </w:p>
-        </w:tc>
-        <w:tc>
-          <w:tcPr>
-            <w:tcW w:type="dxa" w:w="2340"/>
-            <w:shd w:fill="1F4E79"/>
-            <w:tcMar>
-              <w:top w:w="100" w:type="dxa"/>
-              <w:bottom w:w="100" w:type="dxa"/>
-              <w:left w:w="120" w:type="dxa"/>
-              <w:right w:w="120" w:type="dxa"/>
-            </w:tcMar>
-          </w:tcPr>
-          <w:p>
-            <w:pPr>
-              <w:jc w:val="center"/>
-            </w:pPr>
-            <w:r>
-              <w:rPr>
-                <w:b/>
-                <w:color w:val="FFFFFF"/>
-                <w:sz w:val="19"/>
-              </w:rPr>
-              <w:t>Pregunta Clave de la Cátedra</w:t>
-            </w:r>
-          </w:p>
-        </w:tc>
-        <w:tc>
-          <w:tcPr>
-            <w:tcW w:type="dxa" w:w="2340"/>
-            <w:shd w:fill="1F4E79"/>
-            <w:tcMar>
-              <w:top w:w="100" w:type="dxa"/>
-              <w:bottom w:w="100" w:type="dxa"/>
-              <w:left w:w="120" w:type="dxa"/>
-              <w:right w:w="120" w:type="dxa"/>
-            </w:tcMar>
-          </w:tcPr>
-          <w:p>
-            <w:pPr>
-              <w:jc w:val="center"/>
-            </w:pPr>
-            <w:r>
-              <w:rPr>
-                <w:b/>
-                <w:color w:val="FFFFFF"/>
-                <w:sz w:val="19"/>
-              </w:rPr>
-              <w:t>Resultado Cuantitativo (Grupo 8)</w:t>
-            </w:r>
-          </w:p>
-        </w:tc>
-        <w:tc>
-          <w:tcPr>
-            <w:tcW w:type="dxa" w:w="2340"/>
-            <w:shd w:fill="1F4E79"/>
-            <w:tcMar>
-              <w:top w:w="100" w:type="dxa"/>
-              <w:bottom w:w="100" w:type="dxa"/>
-              <w:left w:w="120" w:type="dxa"/>
-              <w:right w:w="120" w:type="dxa"/>
-            </w:tcMar>
-          </w:tcPr>
-          <w:p>
-            <w:pPr>
-              <w:jc w:val="center"/>
-            </w:pPr>
-            <w:r>
-              <w:rPr>
-                <w:b/>
-                <w:color w:val="FFFFFF"/>
-                <w:sz w:val="19"/>
-              </w:rPr>
-              <w:t>Recomendación Estratégica</w:t>
-            </w:r>
-          </w:p>
-        </w:tc>
-      </w:tr>
-      <w:tr>
-        <w:tc>
-          <w:tcPr>
-            <w:tcW w:type="dxa" w:w="2340"/>
-            <w:shd w:fill="F2F5F9"/>
-            <w:tcMar>
-              <w:top w:w="60" w:type="dxa"/>
-              <w:bottom w:w="60" w:type="dxa"/>
-              <w:left w:w="100" w:type="dxa"/>
-              <w:right w:w="100" w:type="dxa"/>
-            </w:tcMar>
-          </w:tcPr>
-          <w:p>
-            <w:r>
-              <w:rPr>
-                <w:sz w:val="18"/>
-              </w:rPr>
-              <w:t>a) Modelo</w:t>
-            </w:r>
-          </w:p>
-        </w:tc>
-        <w:tc>
-          <w:tcPr>
-            <w:tcW w:type="dxa" w:w="2340"/>
-            <w:shd w:fill="F2F5F9"/>
-            <w:tcMar>
-              <w:top w:w="60" w:type="dxa"/>
-              <w:bottom w:w="60" w:type="dxa"/>
-              <w:left w:w="100" w:type="dxa"/>
-              <w:right w:w="100" w:type="dxa"/>
-            </w:tcMar>
-          </w:tcPr>
-          <w:p>
-            <w:r>
-              <w:rPr>
-                <w:sz w:val="18"/>
-              </w:rPr>
-              <w:t>Formalización conceptual y operativa del puerto.</w:t>
-            </w:r>
-          </w:p>
-        </w:tc>
-        <w:tc>
-          <w:tcPr>
-            <w:tcW w:type="dxa" w:w="2340"/>
-            <w:shd w:fill="F2F5F9"/>
-            <w:tcMar>
-              <w:top w:w="60" w:type="dxa"/>
-              <w:bottom w:w="60" w:type="dxa"/>
-              <w:left w:w="100" w:type="dxa"/>
-              <w:right w:w="100" w:type="dxa"/>
-            </w:tcMar>
-          </w:tcPr>
-          <w:p>
-            <w:r>
-              <w:rPr>
-                <w:sz w:val="18"/>
-              </w:rPr>
-              <w:t>Simulador SimPy verificado formalmente mediante Ley de Little (L = lambda * W).</w:t>
-            </w:r>
-          </w:p>
-        </w:tc>
-        <w:tc>
-          <w:tcPr>
-            <w:tcW w:type="dxa" w:w="2340"/>
-            <w:shd w:fill="F2F5F9"/>
-            <w:tcMar>
-              <w:top w:w="60" w:type="dxa"/>
-              <w:bottom w:w="60" w:type="dxa"/>
-              <w:left w:w="100" w:type="dxa"/>
-              <w:right w:w="100" w:type="dxa"/>
-            </w:tcMar>
-          </w:tcPr>
-          <w:p>
-            <w:r>
-              <w:rPr>
-                <w:sz w:val="18"/>
-              </w:rPr>
-              <w:t>Arquitectura modular y reproducible.</w:t>
-            </w:r>
-          </w:p>
-        </w:tc>
-      </w:tr>
-      <w:tr>
-        <w:tc>
-          <w:tcPr>
-            <w:tcW w:type="dxa" w:w="2340"/>
-            <w:tcMar>
-              <w:top w:w="60" w:type="dxa"/>
-              <w:bottom w:w="60" w:type="dxa"/>
-              <w:left w:w="100" w:type="dxa"/>
-              <w:right w:w="100" w:type="dxa"/>
-            </w:tcMar>
-          </w:tcPr>
-          <w:p>
-            <w:r>
-              <w:rPr>
-                <w:sz w:val="18"/>
-              </w:rPr>
-              <w:t>b) Diagnóstico</w:t>
-            </w:r>
-          </w:p>
-        </w:tc>
-        <w:tc>
-          <w:tcPr>
-            <w:tcW w:type="dxa" w:w="2340"/>
-            <w:tcMar>
-              <w:top w:w="60" w:type="dxa"/>
-              <w:bottom w:w="60" w:type="dxa"/>
-              <w:left w:w="100" w:type="dxa"/>
-              <w:right w:w="100" w:type="dxa"/>
-            </w:tcMar>
-          </w:tcPr>
-          <w:p>
-            <w:r>
-              <w:rPr>
-                <w:sz w:val="18"/>
-              </w:rPr>
-              <w:t>Estadía actual (W), cantidad de buques (L) y desglose espera vs atención.</w:t>
-            </w:r>
-          </w:p>
-        </w:tc>
-        <w:tc>
-          <w:tcPr>
-            <w:tcW w:type="dxa" w:w="2340"/>
-            <w:tcMar>
-              <w:top w:w="60" w:type="dxa"/>
-              <w:bottom w:w="60" w:type="dxa"/>
-              <w:left w:w="100" w:type="dxa"/>
-              <w:right w:w="100" w:type="dxa"/>
-            </w:tcMar>
-          </w:tcPr>
-          <w:p>
-            <w:r>
-              <w:rPr>
-                <w:sz w:val="18"/>
-              </w:rPr>
-              <w:t>W = 24.25 h | L = 8.15 buques | Wq = 16.32 h (67.3%) | Ws = 7.92 h (32.7%). 58.1% excede 16h.</w:t>
-            </w:r>
-          </w:p>
-        </w:tc>
-        <w:tc>
-          <w:tcPr>
-            <w:tcW w:type="dxa" w:w="2340"/>
-            <w:tcMar>
-              <w:top w:w="60" w:type="dxa"/>
-              <w:bottom w:w="60" w:type="dxa"/>
-              <w:left w:w="100" w:type="dxa"/>
-              <w:right w:w="100" w:type="dxa"/>
-            </w:tcMar>
-          </w:tcPr>
-          <w:p>
-            <w:r>
-              <w:rPr>
-                <w:sz w:val="18"/>
-              </w:rPr>
-              <w:t>Reclamo naviero plenamente fundado: 2 de cada 3 horas son espera en rada.</w:t>
-            </w:r>
-          </w:p>
-        </w:tc>
-      </w:tr>
-      <w:tr>
-        <w:tc>
-          <w:tcPr>
-            <w:tcW w:type="dxa" w:w="2340"/>
-            <w:shd w:fill="F2F5F9"/>
-            <w:tcMar>
-              <w:top w:w="60" w:type="dxa"/>
-              <w:bottom w:w="60" w:type="dxa"/>
-              <w:left w:w="100" w:type="dxa"/>
-              <w:right w:w="100" w:type="dxa"/>
-            </w:tcMar>
-          </w:tcPr>
-          <w:p>
-            <w:r>
-              <w:rPr>
-                <w:sz w:val="18"/>
-              </w:rPr>
-              <w:t>c) Umbral 16h</w:t>
-            </w:r>
-          </w:p>
-        </w:tc>
-        <w:tc>
-          <w:tcPr>
-            <w:tcW w:type="dxa" w:w="2340"/>
-            <w:shd w:fill="F2F5F9"/>
-            <w:tcMar>
-              <w:top w:w="60" w:type="dxa"/>
-              <w:bottom w:w="60" w:type="dxa"/>
-              <w:left w:w="100" w:type="dxa"/>
-              <w:right w:w="100" w:type="dxa"/>
-            </w:tcMar>
-          </w:tcPr>
-          <w:p>
-            <w:r>
-              <w:rPr>
-                <w:sz w:val="18"/>
-              </w:rPr>
-              <w:t>Demanda máx. admisible y beneficio de incorporar una 4ª grúa STS.</w:t>
-            </w:r>
-          </w:p>
-        </w:tc>
-        <w:tc>
-          <w:tcPr>
-            <w:tcW w:type="dxa" w:w="2340"/>
-            <w:shd w:fill="F2F5F9"/>
-            <w:tcMar>
-              <w:top w:w="60" w:type="dxa"/>
-              <w:bottom w:w="60" w:type="dxa"/>
-              <w:left w:w="100" w:type="dxa"/>
-              <w:right w:w="100" w:type="dxa"/>
-            </w:tcMar>
-          </w:tcPr>
-          <w:p>
-            <w:r>
-              <w:rPr>
-                <w:sz w:val="18"/>
-              </w:rPr>
-              <w:t>Demanda máx actual: &lt;= 7.4 b/d. Con 4ª grúa: W cae a 16.46 h (espera en rada se reduce en 44.5%).</w:t>
-            </w:r>
-          </w:p>
-        </w:tc>
-        <w:tc>
-          <w:tcPr>
-            <w:tcW w:type="dxa" w:w="2340"/>
-            <w:shd w:fill="F2F5F9"/>
-            <w:tcMar>
-              <w:top w:w="60" w:type="dxa"/>
-              <w:bottom w:w="60" w:type="dxa"/>
-              <w:left w:w="100" w:type="dxa"/>
-              <w:right w:w="100" w:type="dxa"/>
-            </w:tcMar>
-          </w:tcPr>
-          <w:p>
-            <w:r>
-              <w:rPr>
-                <w:sz w:val="18"/>
-              </w:rPr>
-              <w:t>Aprobar de inmediato la 4ª grúa. Permite atender la demanda actual (8.09 b/d).</w:t>
-            </w:r>
-          </w:p>
-        </w:tc>
-      </w:tr>
-      <w:tr>
-        <w:tc>
-          <w:tcPr>
-            <w:tcW w:type="dxa" w:w="2340"/>
-            <w:tcMar>
-              <w:top w:w="60" w:type="dxa"/>
-              <w:bottom w:w="60" w:type="dxa"/>
-              <w:left w:w="100" w:type="dxa"/>
-              <w:right w:w="100" w:type="dxa"/>
-            </w:tcMar>
-          </w:tcPr>
-          <w:p>
-            <w:r>
-              <w:rPr>
-                <w:sz w:val="18"/>
-              </w:rPr>
-              <w:t>d) Patio</w:t>
-            </w:r>
-          </w:p>
-        </w:tc>
-        <w:tc>
-          <w:tcPr>
-            <w:tcW w:type="dxa" w:w="2340"/>
-            <w:tcMar>
-              <w:top w:w="60" w:type="dxa"/>
-              <w:bottom w:w="60" w:type="dxa"/>
-              <w:left w:w="100" w:type="dxa"/>
-              <w:right w:w="100" w:type="dxa"/>
-            </w:tcMar>
-          </w:tcPr>
-          <w:p>
-            <w:r>
-              <w:rPr>
-                <w:sz w:val="18"/>
-              </w:rPr>
-              <w:t>Efecto de ventanas horarias de camiones y slots reefer segregados.</w:t>
-            </w:r>
-          </w:p>
-        </w:tc>
-        <w:tc>
-          <w:tcPr>
-            <w:tcW w:type="dxa" w:w="2340"/>
-            <w:tcMar>
-              <w:top w:w="60" w:type="dxa"/>
-              <w:bottom w:w="60" w:type="dxa"/>
-              <w:left w:w="100" w:type="dxa"/>
-              <w:right w:w="100" w:type="dxa"/>
-            </w:tcMar>
-          </w:tcPr>
-          <w:p>
-            <w:r>
-              <w:rPr>
-                <w:sz w:val="18"/>
-              </w:rPr>
-              <w:t>Penalidades bajan camiones tardíos del 25% al 10%, evitando superar el 75% del patio.</w:t>
-            </w:r>
-          </w:p>
-        </w:tc>
-        <w:tc>
-          <w:tcPr>
-            <w:tcW w:type="dxa" w:w="2340"/>
-            <w:tcMar>
-              <w:top w:w="60" w:type="dxa"/>
-              <w:bottom w:w="60" w:type="dxa"/>
-              <w:left w:w="100" w:type="dxa"/>
-              <w:right w:w="100" w:type="dxa"/>
-            </w:tcMar>
-          </w:tcPr>
-          <w:p>
-            <w:r>
-              <w:rPr>
-                <w:sz w:val="18"/>
-              </w:rPr>
-              <w:t>Aplicar penalidad y segregar slots reefer en temporada de fruta (+57% demanda).</w:t>
-            </w:r>
-          </w:p>
-        </w:tc>
-      </w:tr>
-      <w:tr>
-        <w:tc>
-          <w:tcPr>
-            <w:tcW w:type="dxa" w:w="2340"/>
-            <w:shd w:fill="F2F5F9"/>
-            <w:tcMar>
-              <w:top w:w="60" w:type="dxa"/>
-              <w:bottom w:w="60" w:type="dxa"/>
-              <w:left w:w="100" w:type="dxa"/>
-              <w:right w:w="100" w:type="dxa"/>
-            </w:tcMar>
-          </w:tcPr>
-          <w:p>
-            <w:r>
-              <w:rPr>
-                <w:sz w:val="18"/>
-              </w:rPr>
-              <w:t>e) Cruceros</w:t>
-            </w:r>
-          </w:p>
-        </w:tc>
-        <w:tc>
-          <w:tcPr>
-            <w:tcW w:type="dxa" w:w="2340"/>
-            <w:shd w:fill="F2F5F9"/>
-            <w:tcMar>
-              <w:top w:w="60" w:type="dxa"/>
-              <w:bottom w:w="60" w:type="dxa"/>
-              <w:left w:w="100" w:type="dxa"/>
-              <w:right w:w="100" w:type="dxa"/>
-            </w:tcMar>
-          </w:tcPr>
-          <w:p>
-            <w:r>
-              <w:rPr>
-                <w:sz w:val="18"/>
-              </w:rPr>
-              <w:t>Impacto de exclusividad de berma y canon mínimo (USD 60.000 ofrecidos).</w:t>
-            </w:r>
-          </w:p>
-        </w:tc>
-        <w:tc>
-          <w:tcPr>
-            <w:tcW w:type="dxa" w:w="2340"/>
-            <w:shd w:fill="F2F5F9"/>
-            <w:tcMar>
-              <w:top w:w="60" w:type="dxa"/>
-              <w:bottom w:w="60" w:type="dxa"/>
-              <w:left w:w="100" w:type="dxa"/>
-              <w:right w:w="100" w:type="dxa"/>
-            </w:tcMar>
-          </w:tcPr>
-          <w:p>
-            <w:r>
-              <w:rPr>
-                <w:sz w:val="18"/>
-              </w:rPr>
-              <w:t>Reserva exclusiva genera +12.88 h/buque de demora a carga (pérdidas de USD 23.8M a 47.5M).</w:t>
-            </w:r>
-          </w:p>
-        </w:tc>
-        <w:tc>
-          <w:tcPr>
-            <w:tcW w:type="dxa" w:w="2340"/>
-            <w:shd w:fill="F2F5F9"/>
-            <w:tcMar>
-              <w:top w:w="60" w:type="dxa"/>
-              <w:bottom w:w="60" w:type="dxa"/>
-              <w:left w:w="100" w:type="dxa"/>
-              <w:right w:w="100" w:type="dxa"/>
-            </w:tcMar>
-          </w:tcPr>
-          <w:p>
-            <w:r>
-              <w:rPr>
-                <w:sz w:val="18"/>
-              </w:rPr>
-              <w:t>Rechazar reserva exclusiva. Canon de equilibrio: USD 990k - 1.98M por escala. Reportar por separado.</w:t>
-            </w:r>
-          </w:p>
-        </w:tc>
-      </w:tr>
-      <w:tr>
-        <w:tc>
-          <w:tcPr>
-            <w:tcW w:type="dxa" w:w="2340"/>
-            <w:tcMar>
-              <w:top w:w="60" w:type="dxa"/>
-              <w:bottom w:w="60" w:type="dxa"/>
-              <w:left w:w="100" w:type="dxa"/>
-              <w:right w:w="100" w:type="dxa"/>
-            </w:tcMar>
-          </w:tcPr>
-          <w:p>
-            <w:r>
-              <w:rPr>
-                <w:sz w:val="18"/>
-              </w:rPr>
-              <w:t>f) Proyecto Ind.</w:t>
-            </w:r>
-          </w:p>
-        </w:tc>
-        <w:tc>
-          <w:tcPr>
-            <w:tcW w:type="dxa" w:w="2340"/>
-            <w:tcMar>
-              <w:top w:w="60" w:type="dxa"/>
-              <w:bottom w:w="60" w:type="dxa"/>
-              <w:left w:w="100" w:type="dxa"/>
-              <w:right w:w="100" w:type="dxa"/>
-            </w:tcMar>
-          </w:tcPr>
-          <w:p>
-            <w:r>
-              <w:rPr>
-                <w:sz w:val="18"/>
-              </w:rPr>
-              <w:t>Decisión bajo incertidumbre ante Base (+35%) y Optimista (+100%).</w:t>
-            </w:r>
-          </w:p>
-        </w:tc>
-        <w:tc>
-          <w:tcPr>
-            <w:tcW w:type="dxa" w:w="2340"/>
-            <w:tcMar>
-              <w:top w:w="60" w:type="dxa"/>
-              <w:bottom w:w="60" w:type="dxa"/>
-              <w:left w:w="100" w:type="dxa"/>
-              <w:right w:w="100" w:type="dxa"/>
-            </w:tcMar>
-          </w:tcPr>
-          <w:p>
-            <w:r>
-              <w:rPr>
-                <w:sz w:val="18"/>
-              </w:rPr>
-              <w:t>Con 3 bermas el puerto colapsa (rho &gt; 1.13). 4ª berma domina bajo Wald, Savage y Laplace.</w:t>
-            </w:r>
-          </w:p>
-        </w:tc>
-        <w:tc>
-          <w:tcPr>
-            <w:tcW w:type="dxa" w:w="2340"/>
-            <w:tcMar>
-              <w:top w:w="60" w:type="dxa"/>
-              <w:bottom w:w="60" w:type="dxa"/>
-              <w:left w:w="100" w:type="dxa"/>
-              <w:right w:w="100" w:type="dxa"/>
-            </w:tcMar>
-          </w:tcPr>
-          <w:p>
-            <w:r>
-              <w:rPr>
-                <w:sz w:val="18"/>
-              </w:rPr>
-              <w:t>Construir 4ª berma de manera urgente. Convicción directiva valida la decisión.</w:t>
-            </w:r>
-          </w:p>
-        </w:tc>
-      </w:tr>
-      <w:tr>
-        <w:tc>
-          <w:tcPr>
-            <w:tcW w:type="dxa" w:w="2340"/>
-            <w:shd w:fill="F2F5F9"/>
-            <w:tcMar>
-              <w:top w:w="60" w:type="dxa"/>
-              <w:bottom w:w="60" w:type="dxa"/>
-              <w:left w:w="100" w:type="dxa"/>
-              <w:right w:w="100" w:type="dxa"/>
-            </w:tcMar>
-          </w:tcPr>
-          <w:p>
-            <w:r>
-              <w:rPr>
-                <w:sz w:val="18"/>
-              </w:rPr>
-              <w:t>g) Repago 4ª B.</w:t>
-            </w:r>
-          </w:p>
-        </w:tc>
-        <w:tc>
-          <w:tcPr>
-            <w:tcW w:type="dxa" w:w="2340"/>
-            <w:shd w:fill="F2F5F9"/>
-            <w:tcMar>
-              <w:top w:w="60" w:type="dxa"/>
-              <w:bottom w:w="60" w:type="dxa"/>
-              <w:left w:w="100" w:type="dxa"/>
-              <w:right w:w="100" w:type="dxa"/>
-            </w:tcMar>
-          </w:tcPr>
-          <w:p>
-            <w:r>
-              <w:rPr>
-                <w:sz w:val="18"/>
-              </w:rPr>
-              <w:t>Demanda para repago, período de repago y buques-año evitados.</w:t>
-            </w:r>
-          </w:p>
-        </w:tc>
-        <w:tc>
-          <w:tcPr>
-            <w:tcW w:type="dxa" w:w="2340"/>
-            <w:shd w:fill="F2F5F9"/>
-            <w:tcMar>
-              <w:top w:w="60" w:type="dxa"/>
-              <w:bottom w:w="60" w:type="dxa"/>
-              <w:left w:w="100" w:type="dxa"/>
-              <w:right w:w="100" w:type="dxa"/>
-            </w:tcMar>
-          </w:tcPr>
-          <w:p>
-            <w:r>
-              <w:rPr>
-                <w:sz w:val="18"/>
-              </w:rPr>
-              <w:t>Ahorro: 5.97 años-buque evitados/año (USD 49.0M/año). Inversión: USD 12M.</w:t>
-            </w:r>
-          </w:p>
-        </w:tc>
-        <w:tc>
-          <w:tcPr>
-            <w:tcW w:type="dxa" w:w="2340"/>
-            <w:shd w:fill="F2F5F9"/>
-            <w:tcMar>
-              <w:top w:w="60" w:type="dxa"/>
-              <w:bottom w:w="60" w:type="dxa"/>
-              <w:left w:w="100" w:type="dxa"/>
-              <w:right w:w="100" w:type="dxa"/>
-            </w:tcMar>
-          </w:tcPr>
-          <w:p>
-            <w:r>
-              <w:rPr>
-                <w:sz w:val="18"/>
-              </w:rPr>
-              <w:t>Payback de 0.24 años (~3 meses). Rentabilidad económica sobresaliente.</w:t>
-            </w:r>
-          </w:p>
-        </w:tc>
-      </w:tr>
-    </w:tbl>
-    <w:p>
-      <w:r>
-        <w:br w:type="page"/>
-      </w:r>
-    </w:p>
-    <w:p>
-      <w:pPr>
-        <w:pStyle w:val="Heading1"/>
-      </w:pPr>
-      <w:r>
-        <w:rPr>
-          <w:color w:val="1F4E79"/>
-        </w:rPr>
-        <w:t>Sección 1: Modelo Conceptual Formal</w:t>
-      </w:r>
-    </w:p>
-    <w:p>
-      <w:pPr>
-        <w:pStyle w:val="Heading2"/>
-      </w:pPr>
-      <w:r>
-        <w:rPr>
-          <w:color w:val="2F5597"/>
-        </w:rPr>
-        <w:t>1.1. Objetivo y Clasificación de Variables</w:t>
-      </w:r>
-    </w:p>
-    <w:p>
-      <w:r>
-        <w:t>El objetivo general es estructurar un modelo DES para Puerto Sur que permita evaluar cuantitativamente la capacidad de sostener una estadía W &lt;= 16 horas con las navieras regulares, identificar cuellos de botella en muelle y patio, y evaluar la viabilidad de la 4ª grúa, la 4ª berma y el impacto de los cruceros.</w:t>
-      </w:r>
-    </w:p>
-    <w:p>
-      <w:r>
-        <w:t>Se clasificaron rigurosamente las variables de decisión (Bermas B in {2,3,4}, Grúas G in {3,4}, políticas de camiones y cruceros), variables de referencia exógenas (arribos Delta t del Grupo 8, mix de carga, turnos, paradas de cambio de guardia) y variables de salida/KPIs (W, Wq, Ws, % espera, L, Lq y Payback).</w:t>
-      </w:r>
-    </w:p>
-    <w:p>
-      <w:pPr>
-        <w:pStyle w:val="Heading2"/>
-      </w:pPr>
-      <w:r>
-        <w:rPr>
-          <w:color w:val="2F5597"/>
-        </w:rPr>
-        <w:t>1.2. Relación Causal entre Variables</w:t>
-      </w:r>
-    </w:p>
-    <w:p>
-      <w:r>
-        <w:t>A continuación se presenta el Diagrama de Relación Causal entre Variables de Decisión, Exógenas, Estado y Salidas:</w:t>
+        <w:t>En esta sección se fundamenta la arquitectura conceptual del sistema portuario:</w:t>
       </w:r>
     </w:p>
     <w:p>
@@ -1119,18 +430,7 @@
           <w:color w:val="505050"/>
           <w:sz w:val="17"/>
         </w:rPr>
-        <w:t>Figura 1: Diagrama de Influencias Causales entre Variables del Sistema Portuario</w:t>
-      </w:r>
-    </w:p>
-    <w:p>
-      <w:pPr>
-        <w:pStyle w:val="Heading2"/>
-      </w:pPr>
-      <w:r>
-        <w:rPr>
-          <w:color w:val="2F5597"/>
-        </w:rPr>
-        <w:t>1.3. Diagramas IDEF0 (Contexto y Descomposición Funcional)</w:t>
+        <w:t>Figura 1: Diagrama Causal de Relación entre Variables del Sistema Portuario</w:t>
       </w:r>
     </w:p>
     <w:p>
@@ -1234,17 +534,6 @@
       </w:r>
     </w:p>
     <w:p>
-      <w:pPr>
-        <w:pStyle w:val="Heading2"/>
-      </w:pPr>
-      <w:r>
-        <w:rPr>
-          <w:color w:val="2F5597"/>
-        </w:rPr>
-        <w:t>1.4. Lógicas Operativas y Arquitectura del Simulador</w:t>
-      </w:r>
-    </w:p>
-    <w:p>
       <w:r>
         <w:drawing>
           <wp:inline xmlns:a="http://schemas.openxmlformats.org/drawingml/2006/main" xmlns:pic="http://schemas.openxmlformats.org/drawingml/2006/picture">
@@ -1345,11 +634,6 @@
       </w:r>
     </w:p>
     <w:p>
-      <w:r>
-        <w:br w:type="page"/>
-      </w:r>
-    </w:p>
-    <w:p>
       <w:pPr>
         <w:pStyle w:val="Heading1"/>
       </w:pPr>
@@ -1357,1112 +641,7 @@
         <w:rPr>
           <w:color w:val="1F4E79"/>
         </w:rPr>
-        <w:t>Sección 2: Modelo de Datos y Teoría de Colas a Priori</w:t>
-      </w:r>
-    </w:p>
-    <w:p>
-      <w:r>
-        <w:t>Del análisis de las 8.852 escalas de PuertoSur_escalas_G08.csv se derivaron: lambda = 8.086 buques/día, tiempo entre arribos medio = 2.968 h (CV = 2.494), Austral Feeder (43.8%), Andes Container Line (37.6%), TransPatagonia Line (18.7%).</w:t>
-      </w:r>
-    </w:p>
-    <w:tbl>
-      <w:tblPr>
-        <w:tblW w:type="auto" w:w="0"/>
-        <w:jc w:val="center"/>
-        <w:tblLook w:firstColumn="1" w:firstRow="1" w:lastColumn="0" w:lastRow="0" w:noHBand="0" w:noVBand="1" w:val="04A0"/>
-      </w:tblPr>
-      <w:tblGrid>
-        <w:gridCol w:w="1337"/>
-        <w:gridCol w:w="1337"/>
-        <w:gridCol w:w="1337"/>
-        <w:gridCol w:w="1337"/>
-        <w:gridCol w:w="1337"/>
-        <w:gridCol w:w="1337"/>
-        <w:gridCol w:w="1337"/>
-      </w:tblGrid>
-      <w:tr>
-        <w:tc>
-          <w:tcPr>
-            <w:tcW w:type="dxa" w:w="1337"/>
-            <w:shd w:fill="2F5597"/>
-            <w:tcMar>
-              <w:top w:w="100" w:type="dxa"/>
-              <w:bottom w:w="100" w:type="dxa"/>
-              <w:left w:w="120" w:type="dxa"/>
-              <w:right w:w="120" w:type="dxa"/>
-            </w:tcMar>
-          </w:tcPr>
-          <w:p>
-            <w:pPr>
-              <w:jc w:val="center"/>
-            </w:pPr>
-            <w:r>
-              <w:rPr>
-                <w:b/>
-                <w:color w:val="FFFFFF"/>
-                <w:sz w:val="19"/>
-              </w:rPr>
-              <w:t>Modelo Analítico</w:t>
-            </w:r>
-          </w:p>
-        </w:tc>
-        <w:tc>
-          <w:tcPr>
-            <w:tcW w:type="dxa" w:w="1337"/>
-            <w:shd w:fill="2F5597"/>
-            <w:tcMar>
-              <w:top w:w="100" w:type="dxa"/>
-              <w:bottom w:w="100" w:type="dxa"/>
-              <w:left w:w="120" w:type="dxa"/>
-              <w:right w:w="120" w:type="dxa"/>
-            </w:tcMar>
-          </w:tcPr>
-          <w:p>
-            <w:pPr>
-              <w:jc w:val="center"/>
-            </w:pPr>
-            <w:r>
-              <w:rPr>
-                <w:b/>
-                <w:color w:val="FFFFFF"/>
-                <w:sz w:val="19"/>
-              </w:rPr>
-              <w:t>Ws Supuesto</w:t>
-            </w:r>
-          </w:p>
-        </w:tc>
-        <w:tc>
-          <w:tcPr>
-            <w:tcW w:type="dxa" w:w="1337"/>
-            <w:shd w:fill="2F5597"/>
-            <w:tcMar>
-              <w:top w:w="100" w:type="dxa"/>
-              <w:bottom w:w="100" w:type="dxa"/>
-              <w:left w:w="120" w:type="dxa"/>
-              <w:right w:w="120" w:type="dxa"/>
-            </w:tcMar>
-          </w:tcPr>
-          <w:p>
-            <w:pPr>
-              <w:jc w:val="center"/>
-            </w:pPr>
-            <w:r>
-              <w:rPr>
-                <w:b/>
-                <w:color w:val="FFFFFF"/>
-                <w:sz w:val="19"/>
-              </w:rPr>
-              <w:t>Tasa mu</w:t>
-            </w:r>
-          </w:p>
-        </w:tc>
-        <w:tc>
-          <w:tcPr>
-            <w:tcW w:type="dxa" w:w="1337"/>
-            <w:shd w:fill="2F5597"/>
-            <w:tcMar>
-              <w:top w:w="100" w:type="dxa"/>
-              <w:bottom w:w="100" w:type="dxa"/>
-              <w:left w:w="120" w:type="dxa"/>
-              <w:right w:w="120" w:type="dxa"/>
-            </w:tcMar>
-          </w:tcPr>
-          <w:p>
-            <w:pPr>
-              <w:jc w:val="center"/>
-            </w:pPr>
-            <w:r>
-              <w:rPr>
-                <w:b/>
-                <w:color w:val="FFFFFF"/>
-                <w:sz w:val="19"/>
-              </w:rPr>
-              <w:t>Intensidad rho</w:t>
-            </w:r>
-          </w:p>
-        </w:tc>
-        <w:tc>
-          <w:tcPr>
-            <w:tcW w:type="dxa" w:w="1337"/>
-            <w:shd w:fill="2F5597"/>
-            <w:tcMar>
-              <w:top w:w="100" w:type="dxa"/>
-              <w:bottom w:w="100" w:type="dxa"/>
-              <w:left w:w="120" w:type="dxa"/>
-              <w:right w:w="120" w:type="dxa"/>
-            </w:tcMar>
-          </w:tcPr>
-          <w:p>
-            <w:pPr>
-              <w:jc w:val="center"/>
-            </w:pPr>
-            <w:r>
-              <w:rPr>
-                <w:b/>
-                <w:color w:val="FFFFFF"/>
-                <w:sz w:val="19"/>
-              </w:rPr>
-              <w:t>Wq (Rada)</w:t>
-            </w:r>
-          </w:p>
-        </w:tc>
-        <w:tc>
-          <w:tcPr>
-            <w:tcW w:type="dxa" w:w="1337"/>
-            <w:shd w:fill="2F5597"/>
-            <w:tcMar>
-              <w:top w:w="100" w:type="dxa"/>
-              <w:bottom w:w="100" w:type="dxa"/>
-              <w:left w:w="120" w:type="dxa"/>
-              <w:right w:w="120" w:type="dxa"/>
-            </w:tcMar>
-          </w:tcPr>
-          <w:p>
-            <w:pPr>
-              <w:jc w:val="center"/>
-            </w:pPr>
-            <w:r>
-              <w:rPr>
-                <w:b/>
-                <w:color w:val="FFFFFF"/>
-                <w:sz w:val="19"/>
-              </w:rPr>
-              <w:t>W (Estadía)</w:t>
-            </w:r>
-          </w:p>
-        </w:tc>
-        <w:tc>
-          <w:tcPr>
-            <w:tcW w:type="dxa" w:w="1337"/>
-            <w:shd w:fill="2F5597"/>
-            <w:tcMar>
-              <w:top w:w="100" w:type="dxa"/>
-              <w:bottom w:w="100" w:type="dxa"/>
-              <w:left w:w="120" w:type="dxa"/>
-              <w:right w:w="120" w:type="dxa"/>
-            </w:tcMar>
-          </w:tcPr>
-          <w:p>
-            <w:pPr>
-              <w:jc w:val="center"/>
-            </w:pPr>
-            <w:r>
-              <w:rPr>
-                <w:b/>
-                <w:color w:val="FFFFFF"/>
-                <w:sz w:val="19"/>
-              </w:rPr>
-              <w:t>L (Buques)</w:t>
-            </w:r>
-          </w:p>
-        </w:tc>
-      </w:tr>
-      <w:tr>
-        <w:tc>
-          <w:tcPr>
-            <w:tcW w:type="dxa" w:w="1337"/>
-            <w:shd w:fill="F2F5F9"/>
-            <w:tcMar>
-              <w:top w:w="60" w:type="dxa"/>
-              <w:bottom w:w="60" w:type="dxa"/>
-              <w:left w:w="100" w:type="dxa"/>
-              <w:right w:w="100" w:type="dxa"/>
-            </w:tcMar>
-          </w:tcPr>
-          <w:p>
-            <w:r>
-              <w:rPr>
-                <w:sz w:val="18"/>
-              </w:rPr>
-              <w:t>M/M/3 (Dual 2G)</w:t>
-            </w:r>
-          </w:p>
-        </w:tc>
-        <w:tc>
-          <w:tcPr>
-            <w:tcW w:type="dxa" w:w="1337"/>
-            <w:shd w:fill="F2F5F9"/>
-            <w:tcMar>
-              <w:top w:w="60" w:type="dxa"/>
-              <w:bottom w:w="60" w:type="dxa"/>
-              <w:left w:w="100" w:type="dxa"/>
-              <w:right w:w="100" w:type="dxa"/>
-            </w:tcMar>
-          </w:tcPr>
-          <w:p>
-            <w:r>
-              <w:rPr>
-                <w:sz w:val="18"/>
-              </w:rPr>
-              <w:t>6.35 h</w:t>
-            </w:r>
-          </w:p>
-        </w:tc>
-        <w:tc>
-          <w:tcPr>
-            <w:tcW w:type="dxa" w:w="1337"/>
-            <w:shd w:fill="F2F5F9"/>
-            <w:tcMar>
-              <w:top w:w="60" w:type="dxa"/>
-              <w:bottom w:w="60" w:type="dxa"/>
-              <w:left w:w="100" w:type="dxa"/>
-              <w:right w:w="100" w:type="dxa"/>
-            </w:tcMar>
-          </w:tcPr>
-          <w:p>
-            <w:r>
-              <w:rPr>
-                <w:sz w:val="18"/>
-              </w:rPr>
-              <w:t>0.1575</w:t>
-            </w:r>
-          </w:p>
-        </w:tc>
-        <w:tc>
-          <w:tcPr>
-            <w:tcW w:type="dxa" w:w="1337"/>
-            <w:shd w:fill="F2F5F9"/>
-            <w:tcMar>
-              <w:top w:w="60" w:type="dxa"/>
-              <w:bottom w:w="60" w:type="dxa"/>
-              <w:left w:w="100" w:type="dxa"/>
-              <w:right w:w="100" w:type="dxa"/>
-            </w:tcMar>
-          </w:tcPr>
-          <w:p>
-            <w:r>
-              <w:rPr>
-                <w:sz w:val="18"/>
-              </w:rPr>
-              <w:t>0.713</w:t>
-            </w:r>
-          </w:p>
-        </w:tc>
-        <w:tc>
-          <w:tcPr>
-            <w:tcW w:type="dxa" w:w="1337"/>
-            <w:shd w:fill="F2F5F9"/>
-            <w:tcMar>
-              <w:top w:w="60" w:type="dxa"/>
-              <w:bottom w:w="60" w:type="dxa"/>
-              <w:left w:w="100" w:type="dxa"/>
-              <w:right w:w="100" w:type="dxa"/>
-            </w:tcMar>
-          </w:tcPr>
-          <w:p>
-            <w:r>
-              <w:rPr>
-                <w:sz w:val="18"/>
-              </w:rPr>
-              <w:t>3.78 h</w:t>
-            </w:r>
-          </w:p>
-        </w:tc>
-        <w:tc>
-          <w:tcPr>
-            <w:tcW w:type="dxa" w:w="1337"/>
-            <w:shd w:fill="F2F5F9"/>
-            <w:tcMar>
-              <w:top w:w="60" w:type="dxa"/>
-              <w:bottom w:w="60" w:type="dxa"/>
-              <w:left w:w="100" w:type="dxa"/>
-              <w:right w:w="100" w:type="dxa"/>
-            </w:tcMar>
-          </w:tcPr>
-          <w:p>
-            <w:r>
-              <w:rPr>
-                <w:sz w:val="18"/>
-              </w:rPr>
-              <w:t>10.13 h</w:t>
-            </w:r>
-          </w:p>
-        </w:tc>
-        <w:tc>
-          <w:tcPr>
-            <w:tcW w:type="dxa" w:w="1337"/>
-            <w:shd w:fill="F2F5F9"/>
-            <w:tcMar>
-              <w:top w:w="60" w:type="dxa"/>
-              <w:bottom w:w="60" w:type="dxa"/>
-              <w:left w:w="100" w:type="dxa"/>
-              <w:right w:w="100" w:type="dxa"/>
-            </w:tcMar>
-          </w:tcPr>
-          <w:p>
-            <w:r>
-              <w:rPr>
-                <w:sz w:val="18"/>
-              </w:rPr>
-              <w:t>3.41</w:t>
-            </w:r>
-          </w:p>
-        </w:tc>
-      </w:tr>
-      <w:tr>
-        <w:tc>
-          <w:tcPr>
-            <w:tcW w:type="dxa" w:w="1337"/>
-            <w:tcMar>
-              <w:top w:w="60" w:type="dxa"/>
-              <w:bottom w:w="60" w:type="dxa"/>
-              <w:left w:w="100" w:type="dxa"/>
-              <w:right w:w="100" w:type="dxa"/>
-            </w:tcMar>
-          </w:tcPr>
-          <w:p>
-            <w:r>
-              <w:rPr>
-                <w:sz w:val="18"/>
-              </w:rPr>
-              <w:t>M/M/3 (Mixto)</w:t>
-            </w:r>
-          </w:p>
-        </w:tc>
-        <w:tc>
-          <w:tcPr>
-            <w:tcW w:type="dxa" w:w="1337"/>
-            <w:tcMar>
-              <w:top w:w="60" w:type="dxa"/>
-              <w:bottom w:w="60" w:type="dxa"/>
-              <w:left w:w="100" w:type="dxa"/>
-              <w:right w:w="100" w:type="dxa"/>
-            </w:tcMar>
-          </w:tcPr>
-          <w:p>
-            <w:r>
-              <w:rPr>
-                <w:sz w:val="18"/>
-              </w:rPr>
-              <w:t>7.00 h</w:t>
-            </w:r>
-          </w:p>
-        </w:tc>
-        <w:tc>
-          <w:tcPr>
-            <w:tcW w:type="dxa" w:w="1337"/>
-            <w:tcMar>
-              <w:top w:w="60" w:type="dxa"/>
-              <w:bottom w:w="60" w:type="dxa"/>
-              <w:left w:w="100" w:type="dxa"/>
-              <w:right w:w="100" w:type="dxa"/>
-            </w:tcMar>
-          </w:tcPr>
-          <w:p>
-            <w:r>
-              <w:rPr>
-                <w:sz w:val="18"/>
-              </w:rPr>
-              <w:t>0.1429</w:t>
-            </w:r>
-          </w:p>
-        </w:tc>
-        <w:tc>
-          <w:tcPr>
-            <w:tcW w:type="dxa" w:w="1337"/>
-            <w:tcMar>
-              <w:top w:w="60" w:type="dxa"/>
-              <w:bottom w:w="60" w:type="dxa"/>
-              <w:left w:w="100" w:type="dxa"/>
-              <w:right w:w="100" w:type="dxa"/>
-            </w:tcMar>
-          </w:tcPr>
-          <w:p>
-            <w:r>
-              <w:rPr>
-                <w:sz w:val="18"/>
-              </w:rPr>
-              <w:t>0.786</w:t>
-            </w:r>
-          </w:p>
-        </w:tc>
-        <w:tc>
-          <w:tcPr>
-            <w:tcW w:type="dxa" w:w="1337"/>
-            <w:tcMar>
-              <w:top w:w="60" w:type="dxa"/>
-              <w:bottom w:w="60" w:type="dxa"/>
-              <w:left w:w="100" w:type="dxa"/>
-              <w:right w:w="100" w:type="dxa"/>
-            </w:tcMar>
-          </w:tcPr>
-          <w:p>
-            <w:r>
-              <w:rPr>
-                <w:sz w:val="18"/>
-              </w:rPr>
-              <w:t>6.81 h</w:t>
-            </w:r>
-          </w:p>
-        </w:tc>
-        <w:tc>
-          <w:tcPr>
-            <w:tcW w:type="dxa" w:w="1337"/>
-            <w:tcMar>
-              <w:top w:w="60" w:type="dxa"/>
-              <w:bottom w:w="60" w:type="dxa"/>
-              <w:left w:w="100" w:type="dxa"/>
-              <w:right w:w="100" w:type="dxa"/>
-            </w:tcMar>
-          </w:tcPr>
-          <w:p>
-            <w:r>
-              <w:rPr>
-                <w:sz w:val="18"/>
-              </w:rPr>
-              <w:t>13.81 h</w:t>
-            </w:r>
-          </w:p>
-        </w:tc>
-        <w:tc>
-          <w:tcPr>
-            <w:tcW w:type="dxa" w:w="1337"/>
-            <w:tcMar>
-              <w:top w:w="60" w:type="dxa"/>
-              <w:bottom w:w="60" w:type="dxa"/>
-              <w:left w:w="100" w:type="dxa"/>
-              <w:right w:w="100" w:type="dxa"/>
-            </w:tcMar>
-          </w:tcPr>
-          <w:p>
-            <w:r>
-              <w:rPr>
-                <w:sz w:val="18"/>
-              </w:rPr>
-              <w:t>4.65</w:t>
-            </w:r>
-          </w:p>
-        </w:tc>
-      </w:tr>
-      <w:tr>
-        <w:tc>
-          <w:tcPr>
-            <w:tcW w:type="dxa" w:w="1337"/>
-            <w:shd w:fill="F2F5F9"/>
-            <w:tcMar>
-              <w:top w:w="60" w:type="dxa"/>
-              <w:bottom w:w="60" w:type="dxa"/>
-              <w:left w:w="100" w:type="dxa"/>
-              <w:right w:w="100" w:type="dxa"/>
-            </w:tcMar>
-          </w:tcPr>
-          <w:p>
-            <w:r>
-              <w:rPr>
-                <w:sz w:val="18"/>
-              </w:rPr>
-              <w:t>M/M/3 (Promedio)</w:t>
-            </w:r>
-          </w:p>
-        </w:tc>
-        <w:tc>
-          <w:tcPr>
-            <w:tcW w:type="dxa" w:w="1337"/>
-            <w:shd w:fill="F2F5F9"/>
-            <w:tcMar>
-              <w:top w:w="60" w:type="dxa"/>
-              <w:bottom w:w="60" w:type="dxa"/>
-              <w:left w:w="100" w:type="dxa"/>
-              <w:right w:w="100" w:type="dxa"/>
-            </w:tcMar>
-          </w:tcPr>
-          <w:p>
-            <w:r>
-              <w:rPr>
-                <w:sz w:val="18"/>
-              </w:rPr>
-              <w:t>7.50 h</w:t>
-            </w:r>
-          </w:p>
-        </w:tc>
-        <w:tc>
-          <w:tcPr>
-            <w:tcW w:type="dxa" w:w="1337"/>
-            <w:shd w:fill="F2F5F9"/>
-            <w:tcMar>
-              <w:top w:w="60" w:type="dxa"/>
-              <w:bottom w:w="60" w:type="dxa"/>
-              <w:left w:w="100" w:type="dxa"/>
-              <w:right w:w="100" w:type="dxa"/>
-            </w:tcMar>
-          </w:tcPr>
-          <w:p>
-            <w:r>
-              <w:rPr>
-                <w:sz w:val="18"/>
-              </w:rPr>
-              <w:t>0.1333</w:t>
-            </w:r>
-          </w:p>
-        </w:tc>
-        <w:tc>
-          <w:tcPr>
-            <w:tcW w:type="dxa" w:w="1337"/>
-            <w:shd w:fill="F2F5F9"/>
-            <w:tcMar>
-              <w:top w:w="60" w:type="dxa"/>
-              <w:bottom w:w="60" w:type="dxa"/>
-              <w:left w:w="100" w:type="dxa"/>
-              <w:right w:w="100" w:type="dxa"/>
-            </w:tcMar>
-          </w:tcPr>
-          <w:p>
-            <w:r>
-              <w:rPr>
-                <w:sz w:val="18"/>
-              </w:rPr>
-              <w:t>0.842</w:t>
-            </w:r>
-          </w:p>
-        </w:tc>
-        <w:tc>
-          <w:tcPr>
-            <w:tcW w:type="dxa" w:w="1337"/>
-            <w:shd w:fill="F2F5F9"/>
-            <w:tcMar>
-              <w:top w:w="60" w:type="dxa"/>
-              <w:bottom w:w="60" w:type="dxa"/>
-              <w:left w:w="100" w:type="dxa"/>
-              <w:right w:w="100" w:type="dxa"/>
-            </w:tcMar>
-          </w:tcPr>
-          <w:p>
-            <w:r>
-              <w:rPr>
-                <w:sz w:val="18"/>
-              </w:rPr>
-              <w:t>11.37 h</w:t>
-            </w:r>
-          </w:p>
-        </w:tc>
-        <w:tc>
-          <w:tcPr>
-            <w:tcW w:type="dxa" w:w="1337"/>
-            <w:shd w:fill="F2F5F9"/>
-            <w:tcMar>
-              <w:top w:w="60" w:type="dxa"/>
-              <w:bottom w:w="60" w:type="dxa"/>
-              <w:left w:w="100" w:type="dxa"/>
-              <w:right w:w="100" w:type="dxa"/>
-            </w:tcMar>
-          </w:tcPr>
-          <w:p>
-            <w:r>
-              <w:rPr>
-                <w:sz w:val="18"/>
-              </w:rPr>
-              <w:t>18.87 h</w:t>
-            </w:r>
-          </w:p>
-        </w:tc>
-        <w:tc>
-          <w:tcPr>
-            <w:tcW w:type="dxa" w:w="1337"/>
-            <w:shd w:fill="F2F5F9"/>
-            <w:tcMar>
-              <w:top w:w="60" w:type="dxa"/>
-              <w:bottom w:w="60" w:type="dxa"/>
-              <w:left w:w="100" w:type="dxa"/>
-              <w:right w:w="100" w:type="dxa"/>
-            </w:tcMar>
-          </w:tcPr>
-          <w:p>
-            <w:r>
-              <w:rPr>
-                <w:sz w:val="18"/>
-              </w:rPr>
-              <w:t>6.36</w:t>
-            </w:r>
-          </w:p>
-        </w:tc>
-      </w:tr>
-      <w:tr>
-        <w:tc>
-          <w:tcPr>
-            <w:tcW w:type="dxa" w:w="1337"/>
-            <w:tcMar>
-              <w:top w:w="60" w:type="dxa"/>
-              <w:bottom w:w="60" w:type="dxa"/>
-              <w:left w:w="100" w:type="dxa"/>
-              <w:right w:w="100" w:type="dxa"/>
-            </w:tcMar>
-          </w:tcPr>
-          <w:p>
-            <w:r>
-              <w:rPr>
-                <w:sz w:val="18"/>
-              </w:rPr>
-              <w:t>M/G/3 (Allen-Cunneen)</w:t>
-            </w:r>
-          </w:p>
-        </w:tc>
-        <w:tc>
-          <w:tcPr>
-            <w:tcW w:type="dxa" w:w="1337"/>
-            <w:tcMar>
-              <w:top w:w="60" w:type="dxa"/>
-              <w:bottom w:w="60" w:type="dxa"/>
-              <w:left w:w="100" w:type="dxa"/>
-              <w:right w:w="100" w:type="dxa"/>
-            </w:tcMar>
-          </w:tcPr>
-          <w:p>
-            <w:r>
-              <w:rPr>
-                <w:sz w:val="18"/>
-              </w:rPr>
-              <w:t>7.00 h (CV=2.49)</w:t>
-            </w:r>
-          </w:p>
-        </w:tc>
-        <w:tc>
-          <w:tcPr>
-            <w:tcW w:type="dxa" w:w="1337"/>
-            <w:tcMar>
-              <w:top w:w="60" w:type="dxa"/>
-              <w:bottom w:w="60" w:type="dxa"/>
-              <w:left w:w="100" w:type="dxa"/>
-              <w:right w:w="100" w:type="dxa"/>
-            </w:tcMar>
-          </w:tcPr>
-          <w:p>
-            <w:r>
-              <w:rPr>
-                <w:sz w:val="18"/>
-              </w:rPr>
-              <w:t>0.1429</w:t>
-            </w:r>
-          </w:p>
-        </w:tc>
-        <w:tc>
-          <w:tcPr>
-            <w:tcW w:type="dxa" w:w="1337"/>
-            <w:tcMar>
-              <w:top w:w="60" w:type="dxa"/>
-              <w:bottom w:w="60" w:type="dxa"/>
-              <w:left w:w="100" w:type="dxa"/>
-              <w:right w:w="100" w:type="dxa"/>
-            </w:tcMar>
-          </w:tcPr>
-          <w:p>
-            <w:r>
-              <w:rPr>
-                <w:sz w:val="18"/>
-              </w:rPr>
-              <w:t>0.786</w:t>
-            </w:r>
-          </w:p>
-        </w:tc>
-        <w:tc>
-          <w:tcPr>
-            <w:tcW w:type="dxa" w:w="1337"/>
-            <w:tcMar>
-              <w:top w:w="60" w:type="dxa"/>
-              <w:bottom w:w="60" w:type="dxa"/>
-              <w:left w:w="100" w:type="dxa"/>
-              <w:right w:w="100" w:type="dxa"/>
-            </w:tcMar>
-          </w:tcPr>
-          <w:p>
-            <w:r>
-              <w:rPr>
-                <w:sz w:val="18"/>
-              </w:rPr>
-              <w:t>21.50 h</w:t>
-            </w:r>
-          </w:p>
-        </w:tc>
-        <w:tc>
-          <w:tcPr>
-            <w:tcW w:type="dxa" w:w="1337"/>
-            <w:tcMar>
-              <w:top w:w="60" w:type="dxa"/>
-              <w:bottom w:w="60" w:type="dxa"/>
-              <w:left w:w="100" w:type="dxa"/>
-              <w:right w:w="100" w:type="dxa"/>
-            </w:tcMar>
-          </w:tcPr>
-          <w:p>
-            <w:r>
-              <w:rPr>
-                <w:sz w:val="18"/>
-              </w:rPr>
-              <w:t>28.50 h</w:t>
-            </w:r>
-          </w:p>
-        </w:tc>
-        <w:tc>
-          <w:tcPr>
-            <w:tcW w:type="dxa" w:w="1337"/>
-            <w:tcMar>
-              <w:top w:w="60" w:type="dxa"/>
-              <w:bottom w:w="60" w:type="dxa"/>
-              <w:left w:w="100" w:type="dxa"/>
-              <w:right w:w="100" w:type="dxa"/>
-            </w:tcMar>
-          </w:tcPr>
-          <w:p>
-            <w:r>
-              <w:rPr>
-                <w:sz w:val="18"/>
-              </w:rPr>
-              <w:t>9.60</w:t>
-            </w:r>
-          </w:p>
-        </w:tc>
-      </w:tr>
-      <w:tr>
-        <w:tc>
-          <w:tcPr>
-            <w:tcW w:type="dxa" w:w="1337"/>
-            <w:shd w:fill="F2F5F9"/>
-            <w:tcMar>
-              <w:top w:w="60" w:type="dxa"/>
-              <w:bottom w:w="60" w:type="dxa"/>
-              <w:left w:w="100" w:type="dxa"/>
-              <w:right w:w="100" w:type="dxa"/>
-            </w:tcMar>
-          </w:tcPr>
-          <w:p>
-            <w:r>
-              <w:rPr>
-                <w:sz w:val="18"/>
-              </w:rPr>
-              <w:t>M/G/3 (Allen-Cunneen)</w:t>
-            </w:r>
-          </w:p>
-        </w:tc>
-        <w:tc>
-          <w:tcPr>
-            <w:tcW w:type="dxa" w:w="1337"/>
-            <w:shd w:fill="F2F5F9"/>
-            <w:tcMar>
-              <w:top w:w="60" w:type="dxa"/>
-              <w:bottom w:w="60" w:type="dxa"/>
-              <w:left w:w="100" w:type="dxa"/>
-              <w:right w:w="100" w:type="dxa"/>
-            </w:tcMar>
-          </w:tcPr>
-          <w:p>
-            <w:r>
-              <w:rPr>
-                <w:sz w:val="18"/>
-              </w:rPr>
-              <w:t>7.50 h (CV=2.49)</w:t>
-            </w:r>
-          </w:p>
-        </w:tc>
-        <w:tc>
-          <w:tcPr>
-            <w:tcW w:type="dxa" w:w="1337"/>
-            <w:shd w:fill="F2F5F9"/>
-            <w:tcMar>
-              <w:top w:w="60" w:type="dxa"/>
-              <w:bottom w:w="60" w:type="dxa"/>
-              <w:left w:w="100" w:type="dxa"/>
-              <w:right w:w="100" w:type="dxa"/>
-            </w:tcMar>
-          </w:tcPr>
-          <w:p>
-            <w:r>
-              <w:rPr>
-                <w:sz w:val="18"/>
-              </w:rPr>
-              <w:t>0.1333</w:t>
-            </w:r>
-          </w:p>
-        </w:tc>
-        <w:tc>
-          <w:tcPr>
-            <w:tcW w:type="dxa" w:w="1337"/>
-            <w:shd w:fill="F2F5F9"/>
-            <w:tcMar>
-              <w:top w:w="60" w:type="dxa"/>
-              <w:bottom w:w="60" w:type="dxa"/>
-              <w:left w:w="100" w:type="dxa"/>
-              <w:right w:w="100" w:type="dxa"/>
-            </w:tcMar>
-          </w:tcPr>
-          <w:p>
-            <w:r>
-              <w:rPr>
-                <w:sz w:val="18"/>
-              </w:rPr>
-              <w:t>0.842</w:t>
-            </w:r>
-          </w:p>
-        </w:tc>
-        <w:tc>
-          <w:tcPr>
-            <w:tcW w:type="dxa" w:w="1337"/>
-            <w:shd w:fill="F2F5F9"/>
-            <w:tcMar>
-              <w:top w:w="60" w:type="dxa"/>
-              <w:bottom w:w="60" w:type="dxa"/>
-              <w:left w:w="100" w:type="dxa"/>
-              <w:right w:w="100" w:type="dxa"/>
-            </w:tcMar>
-          </w:tcPr>
-          <w:p>
-            <w:r>
-              <w:rPr>
-                <w:sz w:val="18"/>
-              </w:rPr>
-              <w:t>35.86 h</w:t>
-            </w:r>
-          </w:p>
-        </w:tc>
-        <w:tc>
-          <w:tcPr>
-            <w:tcW w:type="dxa" w:w="1337"/>
-            <w:shd w:fill="F2F5F9"/>
-            <w:tcMar>
-              <w:top w:w="60" w:type="dxa"/>
-              <w:bottom w:w="60" w:type="dxa"/>
-              <w:left w:w="100" w:type="dxa"/>
-              <w:right w:w="100" w:type="dxa"/>
-            </w:tcMar>
-          </w:tcPr>
-          <w:p>
-            <w:r>
-              <w:rPr>
-                <w:sz w:val="18"/>
-              </w:rPr>
-              <w:t>43.36 h</w:t>
-            </w:r>
-          </w:p>
-        </w:tc>
-        <w:tc>
-          <w:tcPr>
-            <w:tcW w:type="dxa" w:w="1337"/>
-            <w:shd w:fill="F2F5F9"/>
-            <w:tcMar>
-              <w:top w:w="60" w:type="dxa"/>
-              <w:bottom w:w="60" w:type="dxa"/>
-              <w:left w:w="100" w:type="dxa"/>
-              <w:right w:w="100" w:type="dxa"/>
-            </w:tcMar>
-          </w:tcPr>
-          <w:p>
-            <w:r>
-              <w:rPr>
-                <w:sz w:val="18"/>
-              </w:rPr>
-              <w:t>14.61</w:t>
-            </w:r>
-          </w:p>
-        </w:tc>
-      </w:tr>
-      <w:tr>
-        <w:tc>
-          <w:tcPr>
-            <w:tcW w:type="dxa" w:w="1337"/>
-            <w:tcMar>
-              <w:top w:w="60" w:type="dxa"/>
-              <w:bottom w:w="60" w:type="dxa"/>
-              <w:left w:w="100" w:type="dxa"/>
-              <w:right w:w="100" w:type="dxa"/>
-            </w:tcMar>
-          </w:tcPr>
-          <w:p>
-            <w:r>
-              <w:rPr>
-                <w:sz w:val="18"/>
-              </w:rPr>
-              <w:t>Simulación Real G08</w:t>
-            </w:r>
-          </w:p>
-        </w:tc>
-        <w:tc>
-          <w:tcPr>
-            <w:tcW w:type="dxa" w:w="1337"/>
-            <w:tcMar>
-              <w:top w:w="60" w:type="dxa"/>
-              <w:bottom w:w="60" w:type="dxa"/>
-              <w:left w:w="100" w:type="dxa"/>
-              <w:right w:w="100" w:type="dxa"/>
-            </w:tcMar>
-          </w:tcPr>
-          <w:p>
-            <w:r>
-              <w:rPr>
-                <w:sz w:val="18"/>
-              </w:rPr>
-              <w:t>7.92 h (Empírico)</w:t>
-            </w:r>
-          </w:p>
-        </w:tc>
-        <w:tc>
-          <w:tcPr>
-            <w:tcW w:type="dxa" w:w="1337"/>
-            <w:tcMar>
-              <w:top w:w="60" w:type="dxa"/>
-              <w:bottom w:w="60" w:type="dxa"/>
-              <w:left w:w="100" w:type="dxa"/>
-              <w:right w:w="100" w:type="dxa"/>
-            </w:tcMar>
-          </w:tcPr>
-          <w:p>
-            <w:r>
-              <w:rPr>
-                <w:sz w:val="18"/>
-              </w:rPr>
-              <w:t>Dinámico</w:t>
-            </w:r>
-          </w:p>
-        </w:tc>
-        <w:tc>
-          <w:tcPr>
-            <w:tcW w:type="dxa" w:w="1337"/>
-            <w:tcMar>
-              <w:top w:w="60" w:type="dxa"/>
-              <w:bottom w:w="60" w:type="dxa"/>
-              <w:left w:w="100" w:type="dxa"/>
-              <w:right w:w="100" w:type="dxa"/>
-            </w:tcMar>
-          </w:tcPr>
-          <w:p>
-            <w:r>
-              <w:rPr>
-                <w:sz w:val="18"/>
-              </w:rPr>
-              <w:t>~0.81</w:t>
-            </w:r>
-          </w:p>
-        </w:tc>
-        <w:tc>
-          <w:tcPr>
-            <w:tcW w:type="dxa" w:w="1337"/>
-            <w:tcMar>
-              <w:top w:w="60" w:type="dxa"/>
-              <w:bottom w:w="60" w:type="dxa"/>
-              <w:left w:w="100" w:type="dxa"/>
-              <w:right w:w="100" w:type="dxa"/>
-            </w:tcMar>
-          </w:tcPr>
-          <w:p>
-            <w:r>
-              <w:rPr>
-                <w:sz w:val="18"/>
-              </w:rPr>
-              <w:t>16.32 h</w:t>
-            </w:r>
-          </w:p>
-        </w:tc>
-        <w:tc>
-          <w:tcPr>
-            <w:tcW w:type="dxa" w:w="1337"/>
-            <w:tcMar>
-              <w:top w:w="60" w:type="dxa"/>
-              <w:bottom w:w="60" w:type="dxa"/>
-              <w:left w:w="100" w:type="dxa"/>
-              <w:right w:w="100" w:type="dxa"/>
-            </w:tcMar>
-          </w:tcPr>
-          <w:p>
-            <w:r>
-              <w:rPr>
-                <w:sz w:val="18"/>
-              </w:rPr>
-              <w:t>24.25 h</w:t>
-            </w:r>
-          </w:p>
-        </w:tc>
-        <w:tc>
-          <w:tcPr>
-            <w:tcW w:type="dxa" w:w="1337"/>
-            <w:tcMar>
-              <w:top w:w="60" w:type="dxa"/>
-              <w:bottom w:w="60" w:type="dxa"/>
-              <w:left w:w="100" w:type="dxa"/>
-              <w:right w:w="100" w:type="dxa"/>
-            </w:tcMar>
-          </w:tcPr>
-          <w:p>
-            <w:r>
-              <w:rPr>
-                <w:sz w:val="18"/>
-              </w:rPr>
-              <w:t>8.15</w:t>
-            </w:r>
-          </w:p>
-        </w:tc>
-      </w:tr>
-    </w:tbl>
-    <w:tbl>
-      <w:tblPr>
-        <w:tblW w:type="auto" w:w="0"/>
-        <w:jc w:val="center"/>
-        <w:tblLook w:firstColumn="1" w:firstRow="1" w:lastColumn="0" w:lastRow="0" w:noHBand="0" w:noVBand="1" w:val="04A0"/>
-      </w:tblPr>
-      <w:tblGrid>
-        <w:gridCol w:w="9360"/>
-      </w:tblGrid>
-      <w:tr>
-        <w:tc>
-          <w:tcPr>
-            <w:tcW w:type="dxa" w:w="9360"/>
-            <w:shd w:fill="EBF3FA"/>
-            <w:tcMar>
-              <w:top w:w="100" w:type="dxa"/>
-              <w:bottom w:w="100" w:type="dxa"/>
-              <w:left w:w="140" w:type="dxa"/>
-              <w:right w:w="140" w:type="dxa"/>
-            </w:tcMar>
-          </w:tcPr>
-          <w:p>
-            <w:pPr>
-              <w:spacing w:before="80" w:after="80"/>
-            </w:pPr>
-            <w:r>
-              <w:rPr>
-                <w:b/>
-                <w:color w:val="1F4E79"/>
-                <w:sz w:val="19"/>
-              </w:rPr>
-              <w:t xml:space="preserve">📌 VALIDACIÓN DE COLAS: </w:t>
-            </w:r>
-            <w:r>
-              <w:rPr>
-                <w:i/>
-                <w:sz w:val="19"/>
-              </w:rPr>
-              <w:t>El resultado empírico de la simulación (W = 24.25 h) valida plenamente el modelo conceptual al ubicarse entre el M/M/3 ideal (18.87 h) y el modelo conservador de Allen-Cunneen (28.50 a 43.36 h).</w:t>
-            </w:r>
-          </w:p>
-        </w:tc>
-      </w:tr>
-    </w:tbl>
-    <w:p>
-      <w:pPr>
-        <w:spacing w:after="120"/>
-      </w:pPr>
-    </w:p>
-    <w:p>
-      <w:pPr>
-        <w:pStyle w:val="Heading1"/>
-      </w:pPr>
-      <w:r>
-        <w:rPr>
-          <w:color w:val="1F4E79"/>
-        </w:rPr>
-        <w:t>Sección 3: Experimentación y Análisis Detallado (Consignas b a g)</w:t>
-      </w:r>
-    </w:p>
-    <w:p>
-      <w:pPr>
-        <w:pStyle w:val="Heading2"/>
-      </w:pPr>
-      <w:r>
-        <w:rPr>
-          <w:color w:val="2F5597"/>
-        </w:rPr>
-        <w:t>Consigna b: Diagnóstico de la Operación Actual vs. Umbral de 16h</w:t>
-      </w:r>
-    </w:p>
-    <w:p>
-      <w:r>
-        <w:t>La operación actual promedia W = 24.25 horas, con Wq = 16.32 horas (67.33% espera) y Ws = 7.92 horas (32.67% atención). L = 8.15 buques. El 58.10% de las escalas supera el límite de 16 horas. El reclamo de las navieras es totalmente fundado.</w:t>
+        <w:t>Sección 2: Resultados de la Línea Base y Contraste con Teoría de Colas</w:t>
       </w:r>
     </w:p>
     <w:p>
@@ -2517,18 +696,13 @@
     </w:p>
     <w:p>
       <w:pPr>
-        <w:pStyle w:val="Heading2"/>
+        <w:pStyle w:val="Heading1"/>
       </w:pPr>
       <w:r>
         <w:rPr>
-          <w:color w:val="2F5597"/>
+          <w:color w:val="1F4E79"/>
         </w:rPr>
-        <w:t>Consigna c: Compromiso de 16h y Beneficio de la 4ª Grúa STS</w:t>
-      </w:r>
-    </w:p>
-    <w:p>
-      <w:r>
-        <w:t>La demanda diaria máxima soportable bajo la operación actual para cumplir W &lt;= 16h es de 7.40 buques/día. Con la 4ª grúa, la terminal puede absorber la demanda actual de 8.09 buques/día alcanzando W = 16.46 horas (la espera en rada cae un 44.5% a 9.06 h).</w:t>
+        <w:t>Sección 3: Experimentación y Análisis de Escenarios</w:t>
       </w:r>
     </w:p>
     <w:p>
@@ -2579,70 +753,6 @@
           <w:sz w:val="17"/>
         </w:rPr>
         <w:t>Figura 7: Capacidad Operativa y Cumplimiento del Umbral de 16h vs. Demanda Diaria</w:t>
-      </w:r>
-    </w:p>
-    <w:p>
-      <w:pPr>
-        <w:pStyle w:val="Heading2"/>
-      </w:pPr>
-      <w:r>
-        <w:rPr>
-          <w:color w:val="2F5597"/>
-        </w:rPr>
-        <w:t>Consigna d: Política de Patio y Camiones</w:t>
-      </w:r>
-    </w:p>
-    <w:p>
-      <w:r>
-        <w:t>Penalizar la impuntualidad de camiones reduce la tasa de tardíos del 25% al 10%, evitando superar el 75% del patio (&gt;2.250 slots) en momentos pico. La segregación de slots reefer es imprescindible durante octubre a diciembre, donde la demanda de frío sube un +57%.</w:t>
-      </w:r>
-    </w:p>
-    <w:p>
-      <w:pPr>
-        <w:pStyle w:val="Heading2"/>
-      </w:pPr>
-      <w:r>
-        <w:rPr>
-          <w:color w:val="2F5597"/>
-        </w:rPr>
-        <w:t>Consigna e: Temporada de Cruceros y Reserva Exclusiva</w:t>
-      </w:r>
-    </w:p>
-    <w:p>
-      <w:r>
-        <w:t>Conceder la reserva exclusiva añade +12.88 horas de demora por buque a la carga, generando sobrecostos de inmovilización de USD 23.8M a USD 47.5M. El canon compensatorio debería ser de USD 990k a USD 1.98M por escala (frente a USD 60k ofrecidos). Se debe rechazar la exclusividad y reportar los cruceros por separado.</w:t>
-      </w:r>
-    </w:p>
-    <w:p>
-      <w:pPr>
-        <w:pStyle w:val="Heading2"/>
-      </w:pPr>
-      <w:r>
-        <w:rPr>
-          <w:color w:val="2F5597"/>
-        </w:rPr>
-        <w:t>Consigna f: Proyecto Industrial y Criterios bajo Incertidumbre</w:t>
-      </w:r>
-    </w:p>
-    <w:p>
-      <w:r>
-        <w:t>Bajo los escenarios Base (+35%) y Optimista (+100%), las 3 bermas colapsan (rho &gt; 1.13). Construir la 4ª berma domina bajo todos los criterios de incertidumbre (Wald: +USD 47.8M vs -USD 1.200M; Savage Regret: USD 0M vs USD 850M). La convicción de la gerencia valida la urgencia de la obra.</w:t>
-      </w:r>
-    </w:p>
-    <w:p>
-      <w:pPr>
-        <w:pStyle w:val="Heading2"/>
-      </w:pPr>
-      <w:r>
-        <w:rPr>
-          <w:color w:val="2F5597"/>
-        </w:rPr>
-        <w:t>Consigna g: Análisis de Repago de la 4ª Berma (USD 12M)</w:t>
-      </w:r>
-    </w:p>
-    <w:p>
-      <w:r>
-        <w:t>La 4ª berma ahorra 17.71 horas por buque = 5.97 años-buque de inmovilización evitados al año = USD 48.99 Millones/año de ahorro. El período de repago es de 0.24 años (~2.9 meses).</w:t>
       </w:r>
     </w:p>
     <w:p>
@@ -2703,12 +813,7 @@
         <w:rPr>
           <w:color w:val="1F4E79"/>
         </w:rPr>
-        <w:t>Sección 4: Validación Estadística con Test de Tukey HSD</w:t>
-      </w:r>
-    </w:p>
-    <w:p>
-      <w:r>
-        <w:t>Se certificó la significancia estadística mediante el Test de Tukey HSD (FWER = 0.05):</w:t>
+        <w:t>Sección 4: Validación Estadística y Comparaciones Múltiples de Tukey</w:t>
       </w:r>
     </w:p>
     <w:tbl>
@@ -2747,7 +852,7 @@
                 <w:color w:val="FFFFFF"/>
                 <w:sz w:val="19"/>
               </w:rPr>
-              <w:t>Comparación de Escenarios</w:t>
+              <w:t>Comparación Pareada</w:t>
             </w:r>
           </w:p>
         </w:tc>
@@ -2772,7 +877,7 @@
                 <w:color w:val="FFFFFF"/>
                 <w:sz w:val="19"/>
               </w:rPr>
-              <w:t>Diferencia Medias</w:t>
+              <w:t>Diferencia Media (h)</w:t>
             </w:r>
           </w:p>
         </w:tc>
@@ -2797,7 +902,7 @@
                 <w:color w:val="FFFFFF"/>
                 <w:sz w:val="19"/>
               </w:rPr>
-              <w:t>p-valor adj.</w:t>
+              <w:t>p-adj</w:t>
             </w:r>
           </w:p>
         </w:tc>
@@ -2822,7 +927,7 @@
                 <w:color w:val="FFFFFF"/>
                 <w:sz w:val="19"/>
               </w:rPr>
-              <w:t>IC 95% Inferior</w:t>
+              <w:t>IC Inferior (95%)</w:t>
             </w:r>
           </w:p>
         </w:tc>
@@ -2847,7 +952,7 @@
                 <w:color w:val="FFFFFF"/>
                 <w:sz w:val="19"/>
               </w:rPr>
-              <w:t>IC 95% Superior</w:t>
+              <w:t>IC Superior (95%)</w:t>
             </w:r>
           </w:p>
         </w:tc>
@@ -2872,7 +977,7 @@
                 <w:color w:val="FFFFFF"/>
                 <w:sz w:val="19"/>
               </w:rPr>
-              <w:t>¿Significativo?</w:t>
+              <w:t>Significativo?</w:t>
             </w:r>
           </w:p>
         </w:tc>
@@ -2894,7 +999,7 @@
               <w:rPr>
                 <w:sz w:val="18"/>
               </w:rPr>
-              <w:t>Actual (3G) vs 4 Grúas (4G)</w:t>
+              <w:t>Actual (3G) vs 4 Grúas</w:t>
             </w:r>
           </w:p>
         </w:tc>

</xml_diff>

<commit_message>
fix(diagrams): unificar tiempos de maniobra a 1-2h conjuntas en total en diagramas conceptuales y Word
</commit_message>
<xml_diff>
--- a/INFORME_EJECUTIVO_PUERTO_SUR.docx
+++ b/INFORME_EJECUTIVO_PUERTO_SUR.docx
@@ -1071,7 +1071,7 @@
       <w:r>
         <w:drawing>
           <wp:inline xmlns:a="http://schemas.openxmlformats.org/drawingml/2006/main" xmlns:pic="http://schemas.openxmlformats.org/drawingml/2006/picture">
-            <wp:extent cx="5486400" cy="3740727"/>
+            <wp:extent cx="5486400" cy="3721210"/>
             <wp:docPr id="1" name="Picture 1"/>
             <wp:cNvGraphicFramePr>
               <a:graphicFrameLocks noChangeAspect="1"/>
@@ -1092,7 +1092,7 @@
                   <pic:spPr>
                     <a:xfrm>
                       <a:off x="0" y="0"/>
-                      <a:ext cx="5486400" cy="3740727"/>
+                      <a:ext cx="5486400" cy="3721210"/>
                     </a:xfrm>
                     <a:prstGeom prst="rect"/>
                   </pic:spPr>
@@ -1132,7 +1132,7 @@
       <w:r>
         <w:drawing>
           <wp:inline xmlns:a="http://schemas.openxmlformats.org/drawingml/2006/main" xmlns:pic="http://schemas.openxmlformats.org/drawingml/2006/picture">
-            <wp:extent cx="5486400" cy="3740727"/>
+            <wp:extent cx="5486400" cy="3721210"/>
             <wp:docPr id="2" name="Picture 2"/>
             <wp:cNvGraphicFramePr>
               <a:graphicFrameLocks noChangeAspect="1"/>
@@ -1153,7 +1153,7 @@
                   <pic:spPr>
                     <a:xfrm>
                       <a:off x="0" y="0"/>
-                      <a:ext cx="5486400" cy="3740727"/>
+                      <a:ext cx="5486400" cy="3721210"/>
                     </a:xfrm>
                     <a:prstGeom prst="rect"/>
                   </pic:spPr>
@@ -1182,7 +1182,7 @@
       <w:r>
         <w:drawing>
           <wp:inline xmlns:a="http://schemas.openxmlformats.org/drawingml/2006/main" xmlns:pic="http://schemas.openxmlformats.org/drawingml/2006/picture">
-            <wp:extent cx="5486400" cy="3657600"/>
+            <wp:extent cx="5486400" cy="3599078"/>
             <wp:docPr id="3" name="Picture 3"/>
             <wp:cNvGraphicFramePr>
               <a:graphicFrameLocks noChangeAspect="1"/>
@@ -1203,7 +1203,7 @@
                   <pic:spPr>
                     <a:xfrm>
                       <a:off x="0" y="0"/>
-                      <a:ext cx="5486400" cy="3657600"/>
+                      <a:ext cx="5486400" cy="3599078"/>
                     </a:xfrm>
                     <a:prstGeom prst="rect"/>
                   </pic:spPr>
@@ -1243,7 +1243,7 @@
       <w:r>
         <w:drawing>
           <wp:inline xmlns:a="http://schemas.openxmlformats.org/drawingml/2006/main" xmlns:pic="http://schemas.openxmlformats.org/drawingml/2006/picture">
-            <wp:extent cx="5303520" cy="4773168"/>
+            <wp:extent cx="5303520" cy="4949952"/>
             <wp:docPr id="4" name="Picture 4"/>
             <wp:cNvGraphicFramePr>
               <a:graphicFrameLocks noChangeAspect="1"/>
@@ -1264,7 +1264,7 @@
                   <pic:spPr>
                     <a:xfrm>
                       <a:off x="0" y="0"/>
-                      <a:ext cx="5303520" cy="4773168"/>
+                      <a:ext cx="5303520" cy="4949952"/>
                     </a:xfrm>
                     <a:prstGeom prst="rect"/>
                   </pic:spPr>
@@ -1293,7 +1293,7 @@
       <w:r>
         <w:drawing>
           <wp:inline xmlns:a="http://schemas.openxmlformats.org/drawingml/2006/main" xmlns:pic="http://schemas.openxmlformats.org/drawingml/2006/picture">
-            <wp:extent cx="5486400" cy="3740727"/>
+            <wp:extent cx="5486400" cy="3721210"/>
             <wp:docPr id="5" name="Picture 5"/>
             <wp:cNvGraphicFramePr>
               <a:graphicFrameLocks noChangeAspect="1"/>
@@ -1314,7 +1314,7 @@
                   <pic:spPr>
                     <a:xfrm>
                       <a:off x="0" y="0"/>
-                      <a:ext cx="5486400" cy="3740727"/>
+                      <a:ext cx="5486400" cy="3721210"/>
                     </a:xfrm>
                     <a:prstGeom prst="rect"/>
                   </pic:spPr>

</xml_diff>